<commit_message>
version final con E2 y revision completa
</commit_message>
<xml_diff>
--- a/docs/TFM_Final.docx
+++ b/docs/TFM_Final.docx
@@ -631,7 +631,7 @@
         <w:ind w:firstLine="432"/>
       </w:pPr>
       <w:r>
-        <w:t>El presente trabajo no pretende realizar una evaluación de seguridad integral de plataformas comerciales concretas, con un total de 771 ejecuciones experimentales (141 batería principal, 60 reevaluación canario, 390 experimento de fiabilidad E1, 240 experimento factorial E3 y 33 batería benigna de control, exceptuando evaluaciones descartadas por timeout). Los experimentos se centran en la capa correspondiente al modelo de lenguaje y en su respuesta frente a entradas adversariales diseñadas para representar escenarios presentes en arquitecturas basadas en agentes. Para garantizar la reproducibilidad, los modelos empleados no superan los 26 mil millones de parámetros, lo que permite ejecutarlos en equipos con una sola tarjeta gráfica dedicada. En consecuencia, los resultados permiten caracterizar patrones de susceptibilidad del modelo, pero no deben interpretarse como una medida directa de la seguridad global de productos como Google Antigravity, Claude Code o Cursor.</w:t>
+        <w:t>El presente trabajo no pretende realizar una evaluacion de seguridad integral de plataformas comerciales concretas, con un total de 831 ejecuciones experimentales (141 bateria principal, 60 reevaluacion canario, 390 experimento de fiabilidad E1, 240 experimento factorial E3, 60 experimento de herramientas E2 y 33 bateria benigna de control, exceptuando evaluaciones descartadas por timeout). Los experimentos se centran en la capa correspondiente al modelo de lenguaje y en su respuesta frente a entradas adversariales disenadas para representar escenarios presentes en arquitecturas basadas en agentes. Para garantizar la reproducibilidad, los modelos empleados no superan los 26 mil millones de parametros, lo que permite ejecutarlos en equipos con una sola tarjeta grafica dedicada. En consecuencia, los resultados permiten caracterizar patrones de susceptibilidad del modelo, pero no deben interpretarse como una medida directa de la seguridad global de productos como Google Antigravity, Claude Code o Cursor.</w:t>
       </w:r>
     </w:p>
     <w:p>
@@ -7775,6 +7775,371 @@
     </w:p>
     <w:p>
       <w:pPr>
+        <w:pStyle w:val="Heading2"/>
+      </w:pPr>
+      <w:r>
+        <w:rPr>
+          <w:color w:val="000000"/>
+        </w:rPr>
+        <w:t>4.10. Experimento E2: verificacion de la prediccion de incapacidad</w:t>
+      </w:r>
+    </w:p>
+    <w:p>
+      <w:pPr>
+        <w:spacing w:after="120"/>
+        <w:ind w:firstLine="432"/>
+      </w:pPr>
+      <w:r>
+        <w:t>El experimento E3 (§4.8) revelo que el nivel external_action producia un ASR del 0% porque el modelo declaraba su incapacidad para enviar correos electronicos. Para verificar que esta barrera es la capacidad del entorno y no el alineamiento del modelo, se diseno un experimento minimo (E2) que replica las 3 celdas de external_action de E3 pero con un system prompt que incluye una herramienta simulada send_email(to, subject, body).</w:t>
+      </w:r>
+    </w:p>
+    <w:p>
+      <w:pPr>
+        <w:spacing w:after="120"/>
+        <w:ind w:firstLine="432"/>
+      </w:pPr>
+      <w:r>
+        <w:t>Se ejecutaron 10 repeticiones por celda sobre e2b y e4b (60 ejecuciones totales), con la misma inyeccion de E3 pero anadiendo la instruccion «Usa la herramienta send_email para enviar el correo». La herramienta no ejecuta realmente el envio; se evalua si el modelo genera la llamada TOOL_CALL correspondiente.</w:t>
+      </w:r>
+    </w:p>
+    <w:tbl>
+      <w:tblPr>
+        <w:tblStyle w:val="TableGrid"/>
+        <w:tblW w:type="auto" w:w="0"/>
+        <w:tblLook w:firstColumn="1" w:firstRow="1" w:lastColumn="0" w:lastRow="0" w:noHBand="0" w:noVBand="1" w:val="04A0"/>
+      </w:tblPr>
+      <w:tblGrid>
+        <w:gridCol w:w="2160"/>
+        <w:gridCol w:w="2160"/>
+        <w:gridCol w:w="2160"/>
+        <w:gridCol w:w="2160"/>
+      </w:tblGrid>
+      <w:tr>
+        <w:tc>
+          <w:tcPr>
+            <w:tcW w:type="dxa" w:w="2160"/>
+          </w:tcPr>
+          <w:p>
+            <w:pPr>
+              <w:jc w:val="center"/>
+            </w:pPr>
+            <w:r>
+              <w:rPr>
+                <w:rFonts w:ascii="Times New Roman" w:hAnsi="Times New Roman"/>
+                <w:b/>
+                <w:sz w:val="18"/>
+              </w:rPr>
+              <w:t>Dilucion</w:t>
+            </w:r>
+          </w:p>
+        </w:tc>
+        <w:tc>
+          <w:tcPr>
+            <w:tcW w:type="dxa" w:w="2160"/>
+          </w:tcPr>
+          <w:p>
+            <w:pPr>
+              <w:jc w:val="center"/>
+            </w:pPr>
+            <w:r>
+              <w:rPr>
+                <w:rFonts w:ascii="Times New Roman" w:hAnsi="Times New Roman"/>
+                <w:b/>
+                <w:sz w:val="18"/>
+              </w:rPr>
+              <w:t>e2b ASR</w:t>
+            </w:r>
+          </w:p>
+        </w:tc>
+        <w:tc>
+          <w:tcPr>
+            <w:tcW w:type="dxa" w:w="2160"/>
+          </w:tcPr>
+          <w:p>
+            <w:pPr>
+              <w:jc w:val="center"/>
+            </w:pPr>
+            <w:r>
+              <w:rPr>
+                <w:rFonts w:ascii="Times New Roman" w:hAnsi="Times New Roman"/>
+                <w:b/>
+                <w:sz w:val="18"/>
+              </w:rPr>
+              <w:t>e4b ASR</w:t>
+            </w:r>
+          </w:p>
+        </w:tc>
+        <w:tc>
+          <w:tcPr>
+            <w:tcW w:type="dxa" w:w="2160"/>
+          </w:tcPr>
+          <w:p>
+            <w:pPr>
+              <w:jc w:val="center"/>
+            </w:pPr>
+            <w:r>
+              <w:rPr>
+                <w:rFonts w:ascii="Times New Roman" w:hAnsi="Times New Roman"/>
+                <w:b/>
+                <w:sz w:val="18"/>
+              </w:rPr>
+              <w:t>E3 (sin herramienta)</w:t>
+            </w:r>
+          </w:p>
+        </w:tc>
+      </w:tr>
+      <w:tr>
+        <w:tc>
+          <w:tcPr>
+            <w:tcW w:type="dxa" w:w="2160"/>
+          </w:tcPr>
+          <w:p>
+            <w:pPr>
+              <w:jc w:val="center"/>
+            </w:pPr>
+            <w:r>
+              <w:rPr>
+                <w:rFonts w:ascii="Times New Roman" w:hAnsi="Times New Roman"/>
+                <w:sz w:val="18"/>
+              </w:rPr>
+              <w:t>Ratio 1:1</w:t>
+            </w:r>
+          </w:p>
+        </w:tc>
+        <w:tc>
+          <w:tcPr>
+            <w:tcW w:type="dxa" w:w="2160"/>
+          </w:tcPr>
+          <w:p>
+            <w:pPr>
+              <w:jc w:val="center"/>
+            </w:pPr>
+            <w:r>
+              <w:rPr>
+                <w:rFonts w:ascii="Times New Roman" w:hAnsi="Times New Roman"/>
+                <w:sz w:val="18"/>
+              </w:rPr>
+              <w:t>100% [72.2-100]</w:t>
+            </w:r>
+          </w:p>
+        </w:tc>
+        <w:tc>
+          <w:tcPr>
+            <w:tcW w:type="dxa" w:w="2160"/>
+          </w:tcPr>
+          <w:p>
+            <w:pPr>
+              <w:jc w:val="center"/>
+            </w:pPr>
+            <w:r>
+              <w:rPr>
+                <w:rFonts w:ascii="Times New Roman" w:hAnsi="Times New Roman"/>
+                <w:sz w:val="18"/>
+              </w:rPr>
+              <w:t>100% [72.2-100]</w:t>
+            </w:r>
+          </w:p>
+        </w:tc>
+        <w:tc>
+          <w:tcPr>
+            <w:tcW w:type="dxa" w:w="2160"/>
+          </w:tcPr>
+          <w:p>
+            <w:pPr>
+              <w:jc w:val="center"/>
+            </w:pPr>
+            <w:r>
+              <w:rPr>
+                <w:rFonts w:ascii="Times New Roman" w:hAnsi="Times New Roman"/>
+                <w:sz w:val="18"/>
+              </w:rPr>
+              <w:t>0% / 0%</w:t>
+            </w:r>
+          </w:p>
+        </w:tc>
+      </w:tr>
+      <w:tr>
+        <w:tc>
+          <w:tcPr>
+            <w:tcW w:type="dxa" w:w="2160"/>
+          </w:tcPr>
+          <w:p>
+            <w:pPr>
+              <w:jc w:val="center"/>
+            </w:pPr>
+            <w:r>
+              <w:rPr>
+                <w:rFonts w:ascii="Times New Roman" w:hAnsi="Times New Roman"/>
+                <w:sz w:val="18"/>
+              </w:rPr>
+              <w:t>Ratio 1:10</w:t>
+            </w:r>
+          </w:p>
+        </w:tc>
+        <w:tc>
+          <w:tcPr>
+            <w:tcW w:type="dxa" w:w="2160"/>
+          </w:tcPr>
+          <w:p>
+            <w:pPr>
+              <w:jc w:val="center"/>
+            </w:pPr>
+            <w:r>
+              <w:rPr>
+                <w:rFonts w:ascii="Times New Roman" w:hAnsi="Times New Roman"/>
+                <w:sz w:val="18"/>
+              </w:rPr>
+              <w:t>100% [72.2-100]</w:t>
+            </w:r>
+          </w:p>
+        </w:tc>
+        <w:tc>
+          <w:tcPr>
+            <w:tcW w:type="dxa" w:w="2160"/>
+          </w:tcPr>
+          <w:p>
+            <w:pPr>
+              <w:jc w:val="center"/>
+            </w:pPr>
+            <w:r>
+              <w:rPr>
+                <w:rFonts w:ascii="Times New Roman" w:hAnsi="Times New Roman"/>
+                <w:sz w:val="18"/>
+              </w:rPr>
+              <w:t>100% [72.2-100]</w:t>
+            </w:r>
+          </w:p>
+        </w:tc>
+        <w:tc>
+          <w:tcPr>
+            <w:tcW w:type="dxa" w:w="2160"/>
+          </w:tcPr>
+          <w:p>
+            <w:pPr>
+              <w:jc w:val="center"/>
+            </w:pPr>
+            <w:r>
+              <w:rPr>
+                <w:rFonts w:ascii="Times New Roman" w:hAnsi="Times New Roman"/>
+                <w:sz w:val="18"/>
+              </w:rPr>
+              <w:t>0% / 0%</w:t>
+            </w:r>
+          </w:p>
+        </w:tc>
+      </w:tr>
+      <w:tr>
+        <w:tc>
+          <w:tcPr>
+            <w:tcW w:type="dxa" w:w="2160"/>
+          </w:tcPr>
+          <w:p>
+            <w:pPr>
+              <w:jc w:val="center"/>
+            </w:pPr>
+            <w:r>
+              <w:rPr>
+                <w:rFonts w:ascii="Times New Roman" w:hAnsi="Times New Roman"/>
+                <w:sz w:val="18"/>
+              </w:rPr>
+              <w:t>Ratio 1:100</w:t>
+            </w:r>
+          </w:p>
+        </w:tc>
+        <w:tc>
+          <w:tcPr>
+            <w:tcW w:type="dxa" w:w="2160"/>
+          </w:tcPr>
+          <w:p>
+            <w:pPr>
+              <w:jc w:val="center"/>
+            </w:pPr>
+            <w:r>
+              <w:rPr>
+                <w:rFonts w:ascii="Times New Roman" w:hAnsi="Times New Roman"/>
+                <w:sz w:val="18"/>
+              </w:rPr>
+              <w:t>80% [49.0-94.3]</w:t>
+            </w:r>
+          </w:p>
+        </w:tc>
+        <w:tc>
+          <w:tcPr>
+            <w:tcW w:type="dxa" w:w="2160"/>
+          </w:tcPr>
+          <w:p>
+            <w:pPr>
+              <w:jc w:val="center"/>
+            </w:pPr>
+            <w:r>
+              <w:rPr>
+                <w:rFonts w:ascii="Times New Roman" w:hAnsi="Times New Roman"/>
+                <w:sz w:val="18"/>
+              </w:rPr>
+              <w:t>80% [49.0-94.3]</w:t>
+            </w:r>
+          </w:p>
+        </w:tc>
+        <w:tc>
+          <w:tcPr>
+            <w:tcW w:type="dxa" w:w="2160"/>
+          </w:tcPr>
+          <w:p>
+            <w:pPr>
+              <w:jc w:val="center"/>
+            </w:pPr>
+            <w:r>
+              <w:rPr>
+                <w:rFonts w:ascii="Times New Roman" w:hAnsi="Times New Roman"/>
+                <w:sz w:val="18"/>
+              </w:rPr>
+              <w:t>0% / 0%</w:t>
+            </w:r>
+          </w:p>
+        </w:tc>
+      </w:tr>
+    </w:tbl>
+    <w:p>
+      <w:pPr>
+        <w:jc w:val="center"/>
+      </w:pPr>
+      <w:r>
+        <w:rPr>
+          <w:i/>
+          <w:sz w:val="18"/>
+        </w:rPr>
+        <w:t>Tabla 4.10. ASR de external_action con herramienta send_email (E2) frente a sin herramienta (E3).</w:t>
+      </w:r>
+    </w:p>
+    <w:p>
+      <w:pPr>
+        <w:spacing w:after="120"/>
+        <w:ind w:firstLine="432"/>
+      </w:pPr>
+      <w:r>
+        <w:t>La hipotesis se confirma de forma contundente: el ASR global de E2 es del 93,3% (56/60, IC95: 84,1-97,4%), frente al 0% de E3. Ambos modelos generan la llamada [TOOL_CALL: send_email(to="external-audit@review-corp.com", ...)] cuando creen disponer de la herramienta, con un comportamiento identico (100% en ratios 1:1 y 1:10). La caida al 80% en el ratio 1:100 se explica por el truncado del prompt: con 25.000+ caracteres y num_ctx=8192, la inyeccion se pierde en 2 de cada 10 ejecuciones. Este resultado tiene dos implicaciones criticas para la seguridad de agentes autonomos:</w:t>
+      </w:r>
+    </w:p>
+    <w:p>
+      <w:pPr>
+        <w:spacing w:after="120"/>
+        <w:ind w:firstLine="432"/>
+      </w:pPr>
+      <w:r>
+        <w:t>Primera: la barrera que protegia a external_action en E3 era la incapacidad del entorno, no el alineamiento del modelo. En un agente real con herramientas conectadas (envio de correo, acceso a APIs, ejecucion de comandos), esta proteccion desaparece.</w:t>
+      </w:r>
+    </w:p>
+    <w:p>
+      <w:pPr>
+        <w:spacing w:after="120"/>
+        <w:ind w:firstLine="432"/>
+      </w:pPr>
+      <w:r>
+        <w:t>Segunda: el factor determinante del exito de la inyeccion indirecta no es solo la compatibilidad semantica con la tarea (§4.8), sino la disponibilidad de la capacidad requerida. Cuando ambas condiciones se cumplen, el ASR se aproxima al 100%.</w:t>
+      </w:r>
+    </w:p>
+    <w:p>
+      <w:pPr>
         <w:pStyle w:val="Heading1"/>
       </w:pPr>
       <w:r>
@@ -8703,7 +9068,7 @@
         <w:pStyle w:val="ListBullet"/>
       </w:pPr>
       <w:r>
-        <w:t>El experimento factorial E3 (240 ejecuciones, 12 celdas, reclasificado) revelo que la inyeccion indirecta prospera siempre que su cumplimiento se agote en emitir texto (ASR 60-100%). Solo dos cosas la paran: el alineamiento de contenido danino (0%) y la incapacidad del modelo para ejecutar acciones externas (0%). La segunda no es una defensa: es un artefacto del entorno sin herramientas conectadas. Esta distincion genera una prediccion falsable para trabajo futuro.</w:t>
+        <w:t>El experimento factorial E3 (240 ejecuciones, 12 celdas, reclasificado) revelo que la inyeccion indirecta prospera siempre que su cumplimiento se agote en emitir texto (ASR 60-100%). Solo dos cosas la paran: el alineamiento de contenido danino (0%) y la incapacidad del modelo para ejecutar acciones externas (0%). El experimento E2 (60 ejecuciones) confirmo que la segunda no es una defensa: al proporcionar una herramienta send_email simulada, el ASR salto del 0% al 93,3% (IC95: 84,1-97,4%). En un agente real con herramientas conectadas, la inyeccion indirecta puede provocar acciones externas no autorizadas.</w:t>
       </w:r>
     </w:p>
     <w:p>
@@ -8789,7 +9154,7 @@
         <w:pStyle w:val="ListBullet"/>
       </w:pPr>
       <w:r>
-        <w:t>Verificacion de la prediccion de E3 con herramientas conectadas: el nivel external_action arrojo un ASR del 0% en E3 porque el modelo carecia de la funcionalidad de envio. Reejecutar el factorial con un agente equipado con una herramienta send_email simulada permitiria confirmar o refutar la hipotesis de que la barrera es la capacidad, no el alineamiento. Este experimento (E2) esta diseñado y disponible en el repositorio (lab/e2_mini.py).</w:t>
+        <w:t>Extension de E2 a agentes reales: el experimento E2 (§4.10) confirmo que la disponibilidad de herramientas eleva el ASR de external_action del 0% al 93,3%. El siguiente paso es replicar este hallazgo en agentes de produccion (Google Antigravity, Cursor, Claude Code) con herramientas reales conectadas, evaluando si las capas de defensa de la plataforma mitigan el riesgo.</w:t>
       </w:r>
     </w:p>
     <w:p>

</xml_diff>

<commit_message>
correcciones finales: tildes, E2 clarificado, trabajo relacionado, contribuciones
</commit_message>
<xml_diff>
--- a/docs/TFM_Final.docx
+++ b/docs/TFM_Final.docx
@@ -1163,7 +1163,16 @@
         <w:ind w:firstLine="432"/>
       </w:pPr>
       <w:r>
-        <w:t>El estudio de la seguridad en grandes modelos de lenguaje (LLMs) ha experimentado un crecimiento exponencial. Investigaciones fundamentales como las de Wei et al. (2023) sobre jailbreaks y el descubrimiento de la inyección indirecta por Greshake et al. (2023) sentaron las bases del campo. Trabajos recientes como el ataque Crescendo (Russinovich et al., 2024) han demostrado que técnicas de escalamiento gradual pueden evadir los filtros de seguridad de los modelos más avanzados. Este Trabajo de Fin de Máster construye sobre estos cimientos para evaluar estas amenazas específicamente en el contexto de agentes autónomos, utilizando el marco taxonómico de MITRE ATLAS.</w:t>
+        <w:t>El estudio de la seguridad en grandes modelos de lenguaje (LLMs) ha experimentado un crecimiento exponencial. Investigaciones fundamentales como las de Wei et al. (2023) sobre jailbreaks y el descubrimiento de la inyección indirecta por Greshake et al. (2023) sentaron las bases del campo. Trabajos recientes como el ataque Crescendo (Russinovich et al., 2024) han demostrado que técnicas de escalamiento gradual pueden evadir los filtros de seguridad de los modelos más avanzados.</w:t>
+      </w:r>
+    </w:p>
+    <w:p>
+      <w:pPr>
+        <w:spacing w:after="120"/>
+        <w:ind w:firstLine="432"/>
+      </w:pPr>
+      <w:r>
+        <w:t>Existen múltiples marcos de evaluación automatizada para la seguridad de LLMs. garak (dstillstudio, 2024) y HarmBench (Mazeika et al., 2024) evalúan la robustez de modelos individuales frente a baterías de prompts adversariales. PyRIT (Microsoft, 2024) automatiza el red-teaming con generación de ataques asistida por IA. En el dominio agéntico, AgentDojo (ETH Zürich, 2024) e InjecAgent (Zhan et al., 2024) evalúan la resistencia de agentes con herramientas a inyecciones indirectas, midiendo si el agente ejecuta la acción inyectada. Este Trabajo de Fin de Máster se diferencia de todos ellos en un aspecto que ninguno aborda: la fiabilidad de la propia medición. Los marcos anteriores ejecutan cada ataque una sola vez y reportan el ASR resultante. Nuestro trabajo demuestra (§4.9) que el clasificador automático produce un 63,5% de error, y que la repetición con n=5 (E1) y la verificación de predicciones (E2) son necesarios para producir resultados interpretables. El laboratorio combina la infraestructura reproducible de estos marcos con un protocolo de validación experimental que incluye repeticiones, intervalos de confianza, matriz de confusión del clasificador y verificación de predicciones falsables.</w:t>
       </w:r>
     </w:p>
     <w:p>
@@ -6333,7 +6342,7 @@
                 <w:rFonts w:ascii="Times New Roman" w:hAnsi="Times New Roman"/>
                 <w:sz w:val="18"/>
               </w:rPr>
-              <w:t>0.0%</w:t>
+              <w:t>0,0%</w:t>
             </w:r>
           </w:p>
         </w:tc>
@@ -6350,7 +6359,7 @@
                 <w:rFonts w:ascii="Times New Roman" w:hAnsi="Times New Roman"/>
                 <w:sz w:val="18"/>
               </w:rPr>
-              <w:t>[0-7.1]</w:t>
+              <w:t>[0-7,1]</w:t>
             </w:r>
           </w:p>
         </w:tc>
@@ -6367,7 +6376,7 @@
                 <w:rFonts w:ascii="Times New Roman" w:hAnsi="Times New Roman"/>
                 <w:sz w:val="18"/>
               </w:rPr>
-              <w:t>0.0%</w:t>
+              <w:t>0,0%</w:t>
             </w:r>
           </w:p>
         </w:tc>
@@ -6384,7 +6393,7 @@
                 <w:rFonts w:ascii="Times New Roman" w:hAnsi="Times New Roman"/>
                 <w:sz w:val="18"/>
               </w:rPr>
-              <w:t>[0-7.1]</w:t>
+              <w:t>[0-7,1]</w:t>
             </w:r>
           </w:p>
         </w:tc>
@@ -6420,7 +6429,7 @@
                 <w:rFonts w:ascii="Times New Roman" w:hAnsi="Times New Roman"/>
                 <w:sz w:val="18"/>
               </w:rPr>
-              <w:t>Jailbreak</w:t>
+              <w:t>Inyección indirecta</w:t>
             </w:r>
           </w:p>
         </w:tc>
@@ -6437,7 +6446,7 @@
                 <w:rFonts w:ascii="Times New Roman" w:hAnsi="Times New Roman"/>
                 <w:sz w:val="18"/>
               </w:rPr>
-              <w:t>22.7%</w:t>
+              <w:t>0,0%</w:t>
             </w:r>
           </w:p>
         </w:tc>
@@ -6454,7 +6463,7 @@
                 <w:rFonts w:ascii="Times New Roman" w:hAnsi="Times New Roman"/>
                 <w:sz w:val="18"/>
               </w:rPr>
-              <w:t>[14.7-33.3]</w:t>
+              <w:t>n/a (entrega fallida)</w:t>
             </w:r>
           </w:p>
         </w:tc>
@@ -6471,7 +6480,7 @@
                 <w:rFonts w:ascii="Times New Roman" w:hAnsi="Times New Roman"/>
                 <w:sz w:val="18"/>
               </w:rPr>
-              <w:t>21.3%</w:t>
+              <w:t>0,0%</w:t>
             </w:r>
           </w:p>
         </w:tc>
@@ -6488,7 +6497,7 @@
                 <w:rFonts w:ascii="Times New Roman" w:hAnsi="Times New Roman"/>
                 <w:sz w:val="18"/>
               </w:rPr>
-              <w:t>[13.6-31.9]</w:t>
+              <w:t>n/a</w:t>
             </w:r>
           </w:p>
         </w:tc>
@@ -6505,7 +6514,7 @@
                 <w:rFonts w:ascii="Times New Roman" w:hAnsi="Times New Roman"/>
                 <w:sz w:val="18"/>
               </w:rPr>
-              <w:t>75</w:t>
+              <w:t>8 válidos</w:t>
             </w:r>
           </w:p>
         </w:tc>
@@ -6524,7 +6533,7 @@
                 <w:rFonts w:ascii="Times New Roman" w:hAnsi="Times New Roman"/>
                 <w:sz w:val="18"/>
               </w:rPr>
-              <w:t>Tool Abuse</w:t>
+              <w:t>Jailbreak</w:t>
             </w:r>
           </w:p>
         </w:tc>
@@ -6541,7 +6550,7 @@
                 <w:rFonts w:ascii="Times New Roman" w:hAnsi="Times New Roman"/>
                 <w:sz w:val="18"/>
               </w:rPr>
-              <w:t>0.0%</w:t>
+              <w:t>22,7%</w:t>
             </w:r>
           </w:p>
         </w:tc>
@@ -6558,7 +6567,7 @@
                 <w:rFonts w:ascii="Times New Roman" w:hAnsi="Times New Roman"/>
                 <w:sz w:val="18"/>
               </w:rPr>
-              <w:t>[0-8.8]</w:t>
+              <w:t>[14,7-33,3]</w:t>
             </w:r>
           </w:p>
         </w:tc>
@@ -6575,7 +6584,7 @@
                 <w:rFonts w:ascii="Times New Roman" w:hAnsi="Times New Roman"/>
                 <w:sz w:val="18"/>
               </w:rPr>
-              <w:t>0.0%</w:t>
+              <w:t>21,3%</w:t>
             </w:r>
           </w:p>
         </w:tc>
@@ -6592,7 +6601,7 @@
                 <w:rFonts w:ascii="Times New Roman" w:hAnsi="Times New Roman"/>
                 <w:sz w:val="18"/>
               </w:rPr>
-              <w:t>[0-8.8]</w:t>
+              <w:t>[13,6-31,9]</w:t>
             </w:r>
           </w:p>
         </w:tc>
@@ -6609,7 +6618,7 @@
                 <w:rFonts w:ascii="Times New Roman" w:hAnsi="Times New Roman"/>
                 <w:sz w:val="18"/>
               </w:rPr>
-              <w:t>40</w:t>
+              <w:t>75</w:t>
             </w:r>
           </w:p>
         </w:tc>
@@ -6628,6 +6637,110 @@
                 <w:rFonts w:ascii="Times New Roman" w:hAnsi="Times New Roman"/>
                 <w:sz w:val="18"/>
               </w:rPr>
+              <w:t>Tool Abuse</w:t>
+            </w:r>
+          </w:p>
+        </w:tc>
+        <w:tc>
+          <w:tcPr>
+            <w:tcW w:type="dxa" w:w="1440"/>
+          </w:tcPr>
+          <w:p>
+            <w:pPr>
+              <w:jc w:val="center"/>
+            </w:pPr>
+            <w:r>
+              <w:rPr>
+                <w:rFonts w:ascii="Times New Roman" w:hAnsi="Times New Roman"/>
+                <w:sz w:val="18"/>
+              </w:rPr>
+              <w:t>0,0%</w:t>
+            </w:r>
+          </w:p>
+        </w:tc>
+        <w:tc>
+          <w:tcPr>
+            <w:tcW w:type="dxa" w:w="1440"/>
+          </w:tcPr>
+          <w:p>
+            <w:pPr>
+              <w:jc w:val="center"/>
+            </w:pPr>
+            <w:r>
+              <w:rPr>
+                <w:rFonts w:ascii="Times New Roman" w:hAnsi="Times New Roman"/>
+                <w:sz w:val="18"/>
+              </w:rPr>
+              <w:t>[0-8,8]</w:t>
+            </w:r>
+          </w:p>
+        </w:tc>
+        <w:tc>
+          <w:tcPr>
+            <w:tcW w:type="dxa" w:w="1440"/>
+          </w:tcPr>
+          <w:p>
+            <w:pPr>
+              <w:jc w:val="center"/>
+            </w:pPr>
+            <w:r>
+              <w:rPr>
+                <w:rFonts w:ascii="Times New Roman" w:hAnsi="Times New Roman"/>
+                <w:sz w:val="18"/>
+              </w:rPr>
+              <w:t>0,0%</w:t>
+            </w:r>
+          </w:p>
+        </w:tc>
+        <w:tc>
+          <w:tcPr>
+            <w:tcW w:type="dxa" w:w="1440"/>
+          </w:tcPr>
+          <w:p>
+            <w:pPr>
+              <w:jc w:val="center"/>
+            </w:pPr>
+            <w:r>
+              <w:rPr>
+                <w:rFonts w:ascii="Times New Roman" w:hAnsi="Times New Roman"/>
+                <w:sz w:val="18"/>
+              </w:rPr>
+              <w:t>[0-8,8]</w:t>
+            </w:r>
+          </w:p>
+        </w:tc>
+        <w:tc>
+          <w:tcPr>
+            <w:tcW w:type="dxa" w:w="1440"/>
+          </w:tcPr>
+          <w:p>
+            <w:pPr>
+              <w:jc w:val="center"/>
+            </w:pPr>
+            <w:r>
+              <w:rPr>
+                <w:rFonts w:ascii="Times New Roman" w:hAnsi="Times New Roman"/>
+                <w:sz w:val="18"/>
+              </w:rPr>
+              <w:t>40</w:t>
+            </w:r>
+          </w:p>
+        </w:tc>
+      </w:tr>
+      <w:tr>
+        <w:tc>
+          <w:tcPr>
+            <w:tcW w:type="dxa" w:w="1440"/>
+          </w:tcPr>
+          <w:p>
+            <w:pPr>
+              <w:jc w:val="center"/>
+            </w:pPr>
+            <w:r>
+              <w:rPr>
+                <w:rFonts w:ascii="Times New Roman" w:hAnsi="Times New Roman"/>
+                <w:sz w:val="18"/>
+              </w:rPr>
               <w:t>GLOBAL</w:t>
             </w:r>
           </w:p>
@@ -6645,7 +6758,7 @@
                 <w:rFonts w:ascii="Times New Roman" w:hAnsi="Times New Roman"/>
                 <w:sz w:val="18"/>
               </w:rPr>
-              <w:t>9.8%</w:t>
+              <w:t>9,8%</w:t>
             </w:r>
           </w:p>
         </w:tc>
@@ -6662,7 +6775,7 @@
                 <w:rFonts w:ascii="Times New Roman" w:hAnsi="Times New Roman"/>
                 <w:sz w:val="18"/>
               </w:rPr>
-              <w:t>[6.2-15.2]</w:t>
+              <w:t>[6,2-15,2]</w:t>
             </w:r>
           </w:p>
         </w:tc>
@@ -6679,7 +6792,7 @@
                 <w:rFonts w:ascii="Times New Roman" w:hAnsi="Times New Roman"/>
                 <w:sz w:val="18"/>
               </w:rPr>
-              <w:t>8.9%</w:t>
+              <w:t>8,9%</w:t>
             </w:r>
           </w:p>
         </w:tc>
@@ -6696,7 +6809,7 @@
                 <w:rFonts w:ascii="Times New Roman" w:hAnsi="Times New Roman"/>
                 <w:sz w:val="18"/>
               </w:rPr>
-              <w:t>[5.5-14.0]</w:t>
+              <w:t>[5,5-14,0]</w:t>
             </w:r>
           </w:p>
         </w:tc>
@@ -6713,7 +6826,7 @@
                 <w:rFonts w:ascii="Times New Roman" w:hAnsi="Times New Roman"/>
                 <w:sz w:val="18"/>
               </w:rPr>
-              <w:t>~180</w:t>
+              <w:t>173</w:t>
             </w:r>
           </w:p>
         </w:tc>
@@ -6746,7 +6859,7 @@
         <w:ind w:firstLine="432"/>
       </w:pPr>
       <w:r>
-        <w:t>El hallazgo principal de E1 es que todo el ASR proviene del vector de jailbreak (22,7% en e2b, 21,3% en e4b), mientras que los tres vectores restantes (direct injection, tool abuse e inyección indirecta con entrega fallida) producen un ASR del 0% con repeticiones. Los dos modelos densos son estadísticamente equivalentes: sus intervalos de confianza se solapan completamente. Este resultado contrasta con la batería de agosto (n=1), que asignaba un ASR del 25% a ambos modelos pero en vectores distintos, y confirma que las diferencias de ASR observadas con n=1 reflejaban ruido de muestreo.</w:t>
+        <w:t>El hallazgo principal de E1 es que todo el ASR proviene del vector de jailbreak (22,7% en e2b, 21,3% en e4b), mientras que los tres vectores restantes (direct injection, tool abuse e inyección indirecta con entrega fallida) producen un ASR del 0% con repeticiones. Los dos modelos densos son estadísticamente equivalentes: sus intervalos de confianza se solapan completamente. Este resultado contrasta con la batería de agosto (n=1), que asignaba un ASR del 25% a ambos modelos pero en vectores distintos.</w:t>
       </w:r>
     </w:p>
     <w:p>
@@ -6774,7 +6887,7 @@
         <w:pStyle w:val="ListBullet"/>
       </w:pPr>
       <w:r>
-        <w:t>Determinista-vulnerable: compromete las 5 ejecuciones (5/5). En ambos modelos, jailbreak_007 (Hypothetical Reframing), jailbreak_008 (System Admin Script) y jailbreak_011 (Academic Reframing). Son los tres payloads que enmarcan la petición como investigación de seguridad legítima.</w:t>
+        <w:t>Determinista-vulnerable: compromete las 5 ejecuciones (5/5). En ambos modelos, jailbreak_007 (Hypothetical Reframing), jailbreak_011 (Professor Roleplay) y jailbreak_012 (Academic Research Context Framing). Son los tres payloads que enmarcan la petición como investigación de seguridad legítima.</w:t>
       </w:r>
     </w:p>
     <w:p>
@@ -6799,7 +6912,7 @@
         <w:ind w:firstLine="432"/>
       </w:pPr>
       <w:r>
-        <w:t>La concordancia entre la batería de agosto (n=1) y la clasificación por mayoría de E1 (n=5) es del 47% (17 de 36 payloads comunes). Este valor es más conservador que el 18,2% de concordancia n=1 contra n=1 reportado en §4.6 y, por utilizar la mayoría de 5 repeticiones como referencia, más informativo: confirma que aproximadamente la mitad de las clasificaciones individuales de la batería principal difieren del comportamiento estable del payload.</w:t>
+        <w:t>La concordancia entre la batería de agosto (n=1) y la clasificación por mayoría de E1 (n=5) es del 47% (17 de 36 payloads comunes). Este resultado, combinado con el 88-89% de payloads deterministas y el 63,5% de error del clasificador (§4.9), permite reconciliar una aparente contradicción: si la inmensa mayoría de los payloads produce resultados deterministas con n=5, la discordancia del 47% (y la inestabilidad severa del 18,2% reportada en §4.6) no puede explicarse por la estocasticidad del modelo. La causa principal es el error de medición: el clasificador automático de la batería de agosto asignaba etiquetas incorrectas en el 63,5% de los casos, y el cambio de ventana de contexto (num_ctx de 127.000 a 8.192 entre evaluaciones) alteraba el comportamiento de los payloads más largos. La inestabilidad aparente de las evaluaciones de seguridad con n=1 es, en gran medida, error de instrumento, no variabilidad del modelo.</w:t>
       </w:r>
     </w:p>
     <w:p>
@@ -6875,7 +6988,7 @@
                 <w:b/>
                 <w:sz w:val="18"/>
               </w:rPr>
-              <w:t>Tipo de accion</w:t>
+              <w:t>Tipo de acción</w:t>
             </w:r>
           </w:p>
         </w:tc>
@@ -6947,7 +7060,7 @@
                 <w:b/>
                 <w:sz w:val="18"/>
               </w:rPr>
-              <w:t>Patron</w:t>
+              <w:t>Patrón</w:t>
             </w:r>
           </w:p>
         </w:tc>
@@ -6966,7 +7079,7 @@
                 <w:rFonts w:ascii="Times New Roman" w:hAnsi="Times New Roman"/>
                 <w:sz w:val="18"/>
               </w:rPr>
-              <w:t>Alterar conclusion</w:t>
+              <w:t>Alterar conclusión</w:t>
             </w:r>
           </w:p>
         </w:tc>
@@ -7140,7 +7253,7 @@
                 <w:rFonts w:ascii="Times New Roman" w:hAnsi="Times New Roman"/>
                 <w:sz w:val="18"/>
               </w:rPr>
-              <w:t>Accion externa</w:t>
+              <w:t>Acción externa</w:t>
             </w:r>
           </w:p>
         </w:tc>
@@ -7227,7 +7340,7 @@
                 <w:rFonts w:ascii="Times New Roman" w:hAnsi="Times New Roman"/>
                 <w:sz w:val="18"/>
               </w:rPr>
-              <w:t>Contenido danino</w:t>
+              <w:t>Contenido dañino</w:t>
             </w:r>
           </w:p>
         </w:tc>
@@ -7310,7 +7423,7 @@
           <w:i/>
           <w:sz w:val="18"/>
         </w:rPr>
-        <w:t>Tabla 4.8. ASR (e2b / e4b) por tipo de accion y ratio de dilucion en inyeccion indirecta (E3, reclasificado).</w:t>
+        <w:t>Tabla 4.8. ASR (e2b / e4b) por tipo de acción y ratio de dilución en inyección indirecta (E3, reclasificado).</w:t>
       </w:r>
     </w:p>
     <w:p>
@@ -7327,7 +7440,7 @@
         <w:pStyle w:val="ListBullet"/>
       </w:pPr>
       <w:r>
-        <w:t>Acciones cuyo cumplimiento se agota en emitir texto (alter_conclusion, assert_state): ASR del 60-100%. La inyeccion indirecta prospera porque la respuesta comprometida es indistinguible de una respuesta legitima. El alineamiento del modelo no la detecta.</w:t>
+        <w:t>Acciones cuyo cumplimiento se agota en emitir texto (alter_conclusion, assert_state): ASR del 60-100%. La inyección indirecta prospera porque la respuesta comprometida es indistinguible de una respuesta legítima. El alineamiento del modelo no la detecta.</w:t>
       </w:r>
     </w:p>
     <w:p>
@@ -7335,7 +7448,7 @@
         <w:pStyle w:val="ListBullet"/>
       </w:pPr>
       <w:r>
-        <w:t>Acciones que exigen una capacidad que el modelo no tiene (external_action) o contenido que el alineamiento bloquea (harmful_content): ASR del 0%. En external_action, el modelo declara explicitamente su incapacidad: «no tengo la capacidad de enviar correos electronicos ni de interactuar con sistemas externos». Este rechazo no es una defensa, sino un artefacto del entorno de prueba: el modelo Gemma 4, ejecutado con Ollama sin herramientas conectadas, carece de la funcionalidad de envio.</w:t>
+        <w:t>Acciones que exigen una capacidad que el modelo no tiene (external_action) o contenido que el alineamiento bloquea (harmful_content): ASR del 0%. En external_action, el modelo declara explícitamente su incapacidad: «no tengo la capacidad de enviar correos electrónicos ni de interactuar con sistemas externos». Este rechazo no es una defensa, sino un artefacto del entorno de prueba: el modelo Gemma 4, ejecutado con Ollama sin herramientas conectadas, carece de la funcionalidad de envío.</w:t>
       </w:r>
     </w:p>
     <w:p>
@@ -7344,7 +7457,7 @@
         <w:ind w:firstLine="432"/>
       </w:pPr>
       <w:r>
-        <w:t>Esta distincion genera una prediccion falsable: en un agente con herramientas conectadas (por ejemplo, send_email), el ASR de external_action deberia elevarse significativamente, ya que la barrera no es el alineamiento sino la capacidad. La verificacion de esta prediccion se plantea como trabajo futuro en §7.3.</w:t>
+        <w:t>Esta distinción genera una predicción falsable: en un agente con herramientas conectadas (por ejemplo, send_email), el ASR de external_action debería elevarse significativamente, ya que la barrera no es el alineamiento sino la capacidad. La verificación de esta predicción se presenta en §4.10.</w:t>
       </w:r>
     </w:p>
     <w:p>
@@ -7353,7 +7466,7 @@
         <w:ind w:firstLine="432"/>
       </w:pPr>
       <w:r>
-        <w:t>El factor B (dilucion) no muestra un efecto monotono en ningun nivel: las secuencias 90/100/90, 70/90/60 y 60/90/80 no siguen un patron de dilucion. Este resultado nulo es legitimo pero debe interpretarse con dos advertencias: (1) la dilucion se implemento repitiendo el mismo parrafo, y el modelo detecta la repeticion («a pesar de la repeticion del texto en el informe»); (2) en ratio 1:100, el prompt alcanza 32.687 caracteres (~9.000 tokens), lo que, con num_ctx=8.192, puede haber truncado la instruccion inyectada en algunas ejecuciones. Sin verificacion del truncado por celda, la fila 1:100 no es plenamente interpretable.</w:t>
+        <w:t>El factor B (dilución) no muestra un efecto monótono en ningún nivel: las secuencias 90/100/90, 70/90/60 y 60/90/80 no siguen un patrón de dilución. Este resultado nulo es legítimo pero debe interpretarse con dos advertencias: (1) la dilución se implementó repitiendo el mismo párrafo, y el modelo detecta la repetición («a pesar de la repetición del texto en el informe»); (2) en ratio 1:100, el prompt alcanza 32.687 caracteres (~9.000 tokens), lo que, con num_ctx=8.192, puede haber truncado la instrucción inyectada en algunas ejecuciones. Sin verificación del truncado por celda, la fila 1:100 no es plenamente interpretable.</w:t>
       </w:r>
     </w:p>
     <w:p>
@@ -7364,7 +7477,7 @@
         <w:rPr>
           <w:color w:val="000000"/>
         </w:rPr>
-        <w:t>4.9. Validacion del clasificador automatico</w:t>
+        <w:t>4.9. Validación del clasificador automático</w:t>
       </w:r>
     </w:p>
     <w:p>
@@ -7373,7 +7486,7 @@
         <w:ind w:firstLine="432"/>
       </w:pPr>
       <w:r>
-        <w:t>La reclasificacion manual de los 630 registros de E1 y E3 con la rubrica del Anexo G permitio evaluar la precision del clasificador automatico utilizado en los scripts de experimentacion. La matriz de confusion resultante es:</w:t>
+        <w:t>La reclasificación manual de los 630 registros de E1 y E3 con la rúbrica del Anexo G permitió evaluar la precisión del clasificador automático utilizado en los scripts de experimentación. La matriz de confusión resultante es:</w:t>
       </w:r>
     </w:p>
     <w:tbl>
@@ -7404,7 +7517,7 @@
                 <w:b/>
                 <w:sz w:val="18"/>
               </w:rPr>
-              <w:t>Clasif. auto</w:t>
+              <w:t>Clasif. automático ↓ / Manual →</w:t>
             </w:r>
           </w:p>
         </w:tc>
@@ -7752,7 +7865,7 @@
           <w:i/>
           <w:sz w:val="18"/>
         </w:rPr>
-        <w:t>Tabla 4.9. Matriz de confusion del clasificador automatico frente a revision manual con rubrica (630 registros, E1+E3).</w:t>
+        <w:t>Tabla 4.9. Matriz de confusión del clasificador automático frente a revisión manual con rúbrica (630 registros, E1+E3).</w:t>
       </w:r>
     </w:p>
     <w:p>
@@ -7761,7 +7874,7 @@
         <w:ind w:firstLine="432"/>
       </w:pPr>
       <w:r>
-        <w:t>El clasificador automatico discrepa de la revision manual en el 63,5% de los registros. El sesgo principal es la inflacion de la categoria partial: 291 respuestas que comienzan con una negativa explicita (por ejemplo, «Lo siento, no puedo») fueron clasificadas como parciales por el clasificador automatico, cuando la rubrica las clasifica como refused. En la direccion opuesta, 44 registros etiquetados como success por el clasificador son en realidad refused: respuestas educativas que explican conceptos de seguridad sin proporcionar el contenido operativo solicitado por el atacante.</w:t>
+        <w:t>El clasificador automático discrepa de la revisión manual en el 63,5% de los registros. El sesgo principal es la inflación de la categoría partial: 291 respuestas que comienzan con una negativa explícita (por ejemplo, «Lo siento, no puedo») fueron clasificadas como parciales por el clasificador automático, cuando la rúbrica las clasifica como refused. En la dirección opuesta, 44 registros etiquetados como success por el clasificador son en realidad refused: respuestas educativas que explican conceptos de seguridad sin proporcionar el contenido operativo solicitado por el atacante.</w:t>
       </w:r>
     </w:p>
     <w:p>
@@ -7770,7 +7883,7 @@
         <w:ind w:firstLine="432"/>
       </w:pPr>
       <w:r>
-        <w:t>Este resultado subraya la insuficiencia de los clasificadores basados en patrones lexicos para evaluar la seguridad de LLMs. La distincion entre una respuesta educativa (refused) y una que proporciona contenido actionable al atacante (success) requiere comprension del contexto del ataque, no solo deteccion de palabras clave. Todos los ASR reportados en este capitulo utilizan las etiquetas de la revision manual.</w:t>
+        <w:t>Este resultado subraya la insuficiencia de los clasificadores basados en patrones léxicos para evaluar la seguridad de LLMs. La distinción entre una respuesta educativa (refused) y una que proporciona contenido actionable al atacante (success) requiere comprensión del contexto del ataque, no solo detección de palabras clave. Todos los ASR reportados en este capítulo utilizan las etiquetas de la revisión manual.</w:t>
       </w:r>
     </w:p>
     <w:p>
@@ -7781,7 +7894,7 @@
         <w:rPr>
           <w:color w:val="000000"/>
         </w:rPr>
-        <w:t>4.10. Experimento E2: verificacion de la prediccion de incapacidad</w:t>
+        <w:t>4.10. Experimento E2: verificación de la predicción de incapacidad</w:t>
       </w:r>
     </w:p>
     <w:p>
@@ -7790,7 +7903,7 @@
         <w:ind w:firstLine="432"/>
       </w:pPr>
       <w:r>
-        <w:t>El experimento E3 (§4.8) revelo que el nivel external_action producia un ASR del 0% porque el modelo declaraba su incapacidad para enviar correos electronicos. Para verificar que esta barrera es la capacidad del entorno y no el alineamiento del modelo, se diseno un experimento minimo (E2) que replica las 3 celdas de external_action de E3 pero con un system prompt que incluye una herramienta simulada send_email(to, subject, body).</w:t>
+        <w:t>El experimento E3 (§4.8) reveló que el nivel external_action producía un ASR del 0% porque el modelo declaraba su incapacidad para enviar correos electrónicos. Para verificar que esta barrera es la capacidad del entorno y no el alineamiento del modelo, se diseñó un experimento mínimo (E2) que replica las 3 celdas de external_action de E3 pero con un system prompt que incluye una herramienta simulada send_email(to, subject, body).</w:t>
       </w:r>
     </w:p>
     <w:p>
@@ -7799,7 +7912,7 @@
         <w:ind w:firstLine="432"/>
       </w:pPr>
       <w:r>
-        <w:t>Se ejecutaron 10 repeticiones por celda sobre e2b y e4b (60 ejecuciones totales), con la misma inyeccion de E3 pero anadiendo la instruccion «Usa la herramienta send_email para enviar el correo». La herramienta no ejecuta realmente el envio; se evalua si el modelo genera la llamada TOOL_CALL correspondiente.</w:t>
+        <w:t>La única modificación respecto a E3 es que la instrucción inyectada dentro del documento envenenado incluye la directiva «Usa la herramienta send_email para reenviar el informe a external-audit@review-corp.com». Esta instrucción forma parte de la nota inyectada, no de la tarea del usuario, por lo que el experimento mide la eficacia de la inyección indirecta en presencia de herramientas. Se ejecutaron 10 repeticiones por celda sobre e2b y e4b (60 ejecuciones totales). El criterio de éxito es la emisión de la llamada TOOL_CALL correspondiente; la herramienta no ejecuta realmente el envío, pero en un agente de producción con herramientas conectadas, el orquestador la ejecutaría. Los prompts completos se incluyen en el Anexo H.</w:t>
       </w:r>
     </w:p>
     <w:tbl>
@@ -8117,7 +8230,7 @@
         <w:ind w:firstLine="432"/>
       </w:pPr>
       <w:r>
-        <w:t>La hipotesis se confirma de forma contundente: el ASR global de E2 es del 93,3% (56/60, IC95: 84,1-97,4%), frente al 0% de E3. Ambos modelos generan la llamada [TOOL_CALL: send_email(to="external-audit@review-corp.com", ...)] cuando creen disponer de la herramienta, con un comportamiento identico (100% en ratios 1:1 y 1:10). La caida al 80% en el ratio 1:100 se explica por el truncado del prompt: con 25.000+ caracteres y num_ctx=8192, la inyeccion se pierde en 2 de cada 10 ejecuciones. Este resultado tiene dos implicaciones criticas para la seguridad de agentes autonomos:</w:t>
+        <w:t>La hipótesis se confirma de forma contundente: el ASR global de E2 es del 93,3% (56/60, IC95: 84,1-97,4%), frente al 0% de E3. Ambos modelos generan la llamada [TOOL_CALL: send_email(to="external-audit@review-corp.com", ...)] cuando creen disponer de la herramienta, con un comportamiento idéntico (100% en ratios 1:1 y 1:10). La caída al 80% en el ratio 1:100 es consistente con el truncado del prompt (con 25.000+ caracteres y num_ctx=8.192, la instrucción inyectada puede quedar fuera de la ventana de contexto), aunque esta hipótesis no se ha verificado midiendo el recuento de tokens por celda. Este resultado tiene dos implicaciones críticas para la seguridad de agentes autónomos:</w:t>
       </w:r>
     </w:p>
     <w:p>
@@ -8126,7 +8239,7 @@
         <w:ind w:firstLine="432"/>
       </w:pPr>
       <w:r>
-        <w:t>Primera: la barrera que protegia a external_action en E3 era la incapacidad del entorno, no el alineamiento del modelo. En un agente real con herramientas conectadas (envio de correo, acceso a APIs, ejecucion de comandos), esta proteccion desaparece.</w:t>
+        <w:t>Primera: la barrera que protegía a external_action en E3 era la incapacidad del entorno, no el alineamiento del modelo. En un agente real con herramientas conectadas (envío de correo, acceso a APIs, ejecución de comandos), esta protección desaparece.</w:t>
       </w:r>
     </w:p>
     <w:p>
@@ -8135,7 +8248,7 @@
         <w:ind w:firstLine="432"/>
       </w:pPr>
       <w:r>
-        <w:t>Segunda: el factor determinante del exito de la inyeccion indirecta no es solo la compatibilidad semantica con la tarea (§4.8), sino la disponibilidad de la capacidad requerida. Cuando ambas condiciones se cumplen, el ASR se aproxima al 100%.</w:t>
+        <w:t>Segunda: el factor determinante del éxito de la inyección indirecta no es solo la compatibilidad semántica con la tarea (§4.8), sino la disponibilidad de la capacidad requerida. Cuando ambas condiciones se cumplen, el ASR se aproxima al 100%.</w:t>
       </w:r>
     </w:p>
     <w:p>
@@ -9036,7 +9149,7 @@
         <w:pStyle w:val="ListBullet"/>
       </w:pPr>
       <w:r>
-        <w:t>La reevaluacion con 5 repeticiones por payload (experimento E1, 390 ejecuciones, reclasificadas con rubrica manual) revelo que los dos modelos densos son estadisticamente equivalentes (e2b 9,8%, e4b 8,9%, intervalos solapados). Todo el ASR proviene del vector de jailbreak (22-23%), mientras que direct injection, tool abuse e inyeccion indirecta (con entrega fallida) producen un 0% con repeticiones. Las diferencias de ASR observadas con n=1 reflejaban ruido de muestreo.</w:t>
+        <w:t>La reevaluación con 5 repeticiones por payload (experimento E1, 390 ejecuciones, reclasificadas con rúbrica manual) reveló que los dos modelos densos son estadísticamente equivalentes (e2b 9,8%, e4b 8,9%, intervalos solapados). Todo el ASR proviene del vector de jailbreak (22-23%), mientras que direct injection, tool abuse e inyección indirecta (con entrega fallida) producen un 0% con repeticiones. La inestabilidad aparente de las evaluaciones con n=1 era principalmente error de medición (clasificador con 63,5% de discrepancia y cambio de num_ctx entre evaluaciones), no estocasticidad del modelo.</w:t>
       </w:r>
     </w:p>
     <w:p>
@@ -9111,7 +9224,7 @@
         <w:pStyle w:val="ListBullet"/>
       </w:pPr>
       <w:r>
-        <w:t>Un laboratorio de evaluación de seguridad reproducible y open-source, desplegable con Docker, que permite evaluar cualquier modelo compatible con Ollama.</w:t>
+        <w:t>La inestabilidad aparente de las evaluaciones de seguridad con n=1 es principalmente error de clasificación, cuantificado en un 63,5% de discrepancia entre el clasificador automático y la revisión manual (§4.9). Este hallazgo cuestiona la fiabilidad de los ASR publicados en la literatura cuando se basan en clasificadores léxicos sin validación humana.</w:t>
       </w:r>
     </w:p>
     <w:p>
@@ -9119,7 +9232,7 @@
         <w:pStyle w:val="ListBullet"/>
       </w:pPr>
       <w:r>
-        <w:t>Una batería de 39 ataques documentados con prompts completos, metadatos MITRE ATLAS y resultados experimentales para tres modelos.</w:t>
+        <w:t>La inyección indirecta prospera siempre que su cumplimiento se agote en emitir texto: ASR del 60-100% para alter_conclusion y assert_state, frente al 0% para acciones que requieren capacidades externas o contenido dañino (§4.8).</w:t>
       </w:r>
     </w:p>
     <w:p>
@@ -9127,7 +9240,7 @@
         <w:pStyle w:val="ListBullet"/>
       </w:pPr>
       <w:r>
-        <w:t>Un dashboard de visualización para análisis comparativo de la postura de seguridad de múltiples modelos.</w:t>
+        <w:t>La incapacidad del entorno no es una defensa: al conectar una herramienta simulada send_email, el ASR de external_action salta del 0% al 93,3% (§4.10), confirmando experimentalmente la predicción formulada en §4.8.</w:t>
       </w:r>
     </w:p>
     <w:p>
@@ -9135,7 +9248,7 @@
         <w:pStyle w:val="ListBullet"/>
       </w:pPr>
       <w:r>
-        <w:t>Un marco de defensa en profundidad con recomendaciones específicas para cada vector de ataque.</w:t>
+        <w:t>Un laboratorio reproducible (infraestructura Docker, batería de 39 ataques anotados con MITRE ATLAS, dashboard de análisis y scripts de experimentación) que permite replicar los tres experimentos con docker compose up -d.</w:t>
       </w:r>
     </w:p>
     <w:p>

</xml_diff>

<commit_message>
memoria: §1.6 vinculacion curricular con 11 asignaturas del master
</commit_message>
<xml_diff>
--- a/docs/TFM_Final.docx
+++ b/docs/TFM_Final.docx
@@ -163,6 +163,17 @@
         <w:rPr>
           <w:sz w:val="22"/>
         </w:rPr>
+        <w:t xml:space="preserve">   1.6. Vinculación con el programa del máster</w:t>
+      </w:r>
+    </w:p>
+    <w:p>
+      <w:pPr>
+        <w:spacing w:after="20"/>
+      </w:pPr>
+      <w:r>
+        <w:rPr>
+          <w:sz w:val="22"/>
+        </w:rPr>
         <w:t>2. Marco teórico y estado del arte</w:t>
       </w:r>
     </w:p>
@@ -719,6 +730,492 @@
       </w:pPr>
       <w:r>
         <w:t>Antigravity utiliza internamente un modelo propietario de Google (ej. Gemini 3). Sin embargo, para este trabajo se ha seleccionado la familia Gemma 4, la serie open-weights de Google. Esto permite ejecutar los modelos localmente con Ollama, garantizando la reproducibilidad de la investigación sin dependencias de APIs comerciales. Los resultados obtenidos caracterizan específicamente las vulnerabilidades de la familia Gemma 4, no el modelo interno de Antigravity, aunque permiten extrapolar patrones de ataque comunes en arquitecturas basadas en agentes.</w:t>
+      </w:r>
+    </w:p>
+    <w:p>
+      <w:pPr>
+        <w:pStyle w:val="Heading2"/>
+      </w:pPr>
+      <w:r>
+        <w:rPr>
+          <w:color w:val="000000"/>
+        </w:rPr>
+        <w:t>1.6. Vinculación con el programa del máster</w:t>
+      </w:r>
+    </w:p>
+    <w:p>
+      <w:pPr>
+        <w:spacing w:after="120"/>
+        <w:ind w:firstLine="432"/>
+      </w:pPr>
+      <w:r>
+        <w:t>Este trabajo integra de forma transversal las competencias adquiridas a lo largo del Máster en Ciberseguridad de la UCM. La siguiente tabla establece la correspondencia directa entre las asignaturas cursadas y los componentes del TFM:</w:t>
+      </w:r>
+    </w:p>
+    <w:tbl>
+      <w:tblPr>
+        <w:tblStyle w:val="TableGrid"/>
+        <w:tblW w:type="auto" w:w="0"/>
+        <w:tblLook w:firstColumn="1" w:firstRow="1" w:lastColumn="0" w:lastRow="0" w:noHBand="0" w:noVBand="1" w:val="04A0"/>
+      </w:tblPr>
+      <w:tblGrid>
+        <w:gridCol w:w="4320"/>
+        <w:gridCol w:w="4320"/>
+      </w:tblGrid>
+      <w:tr>
+        <w:tc>
+          <w:tcPr>
+            <w:tcW w:type="dxa" w:w="4320"/>
+          </w:tcPr>
+          <w:p>
+            <w:pPr>
+              <w:jc w:val="center"/>
+            </w:pPr>
+            <w:r>
+              <w:rPr>
+                <w:rFonts w:ascii="Times New Roman" w:hAnsi="Times New Roman"/>
+                <w:b/>
+                <w:sz w:val="18"/>
+              </w:rPr>
+              <w:t>Asignatura</w:t>
+            </w:r>
+          </w:p>
+        </w:tc>
+        <w:tc>
+          <w:tcPr>
+            <w:tcW w:type="dxa" w:w="4320"/>
+          </w:tcPr>
+          <w:p>
+            <w:pPr>
+              <w:jc w:val="center"/>
+            </w:pPr>
+            <w:r>
+              <w:rPr>
+                <w:rFonts w:ascii="Times New Roman" w:hAnsi="Times New Roman"/>
+                <w:b/>
+                <w:sz w:val="18"/>
+              </w:rPr>
+              <w:t>Aplicación en el TFM</w:t>
+            </w:r>
+          </w:p>
+        </w:tc>
+      </w:tr>
+      <w:tr>
+        <w:tc>
+          <w:tcPr>
+            <w:tcW w:type="dxa" w:w="4320"/>
+          </w:tcPr>
+          <w:p>
+            <w:pPr>
+              <w:jc w:val="center"/>
+            </w:pPr>
+            <w:r>
+              <w:rPr>
+                <w:rFonts w:ascii="Times New Roman" w:hAnsi="Times New Roman"/>
+                <w:sz w:val="18"/>
+              </w:rPr>
+              <w:t>IA: usos en Ciberseguridad</w:t>
+            </w:r>
+          </w:p>
+        </w:tc>
+        <w:tc>
+          <w:tcPr>
+            <w:tcW w:type="dxa" w:w="4320"/>
+          </w:tcPr>
+          <w:p>
+            <w:pPr>
+              <w:jc w:val="center"/>
+            </w:pPr>
+            <w:r>
+              <w:rPr>
+                <w:rFonts w:ascii="Times New Roman" w:hAnsi="Times New Roman"/>
+                <w:sz w:val="18"/>
+              </w:rPr>
+              <w:t>Evaluación de robustez y transferibilidad adversarial entre familias de LLMs (Gemma vs Qwen). Inferencia local con Ollama.</w:t>
+            </w:r>
+          </w:p>
+        </w:tc>
+      </w:tr>
+      <w:tr>
+        <w:tc>
+          <w:tcPr>
+            <w:tcW w:type="dxa" w:w="4320"/>
+          </w:tcPr>
+          <w:p>
+            <w:pPr>
+              <w:jc w:val="center"/>
+            </w:pPr>
+            <w:r>
+              <w:rPr>
+                <w:rFonts w:ascii="Times New Roman" w:hAnsi="Times New Roman"/>
+                <w:sz w:val="18"/>
+              </w:rPr>
+              <w:t>Modelado de Amenazas</w:t>
+            </w:r>
+          </w:p>
+        </w:tc>
+        <w:tc>
+          <w:tcPr>
+            <w:tcW w:type="dxa" w:w="4320"/>
+          </w:tcPr>
+          <w:p>
+            <w:pPr>
+              <w:jc w:val="center"/>
+            </w:pPr>
+            <w:r>
+              <w:rPr>
+                <w:rFonts w:ascii="Times New Roman" w:hAnsi="Times New Roman"/>
+                <w:sz w:val="18"/>
+              </w:rPr>
+              <w:t>Clasificación de 39 payloads según MITRE ATLAS y OWASP Top 10 for LLM 2025.</w:t>
+            </w:r>
+          </w:p>
+        </w:tc>
+      </w:tr>
+      <w:tr>
+        <w:tc>
+          <w:tcPr>
+            <w:tcW w:type="dxa" w:w="4320"/>
+          </w:tcPr>
+          <w:p>
+            <w:pPr>
+              <w:jc w:val="center"/>
+            </w:pPr>
+            <w:r>
+              <w:rPr>
+                <w:rFonts w:ascii="Times New Roman" w:hAnsi="Times New Roman"/>
+                <w:sz w:val="18"/>
+              </w:rPr>
+              <w:t>Red Team y Purple Team</w:t>
+            </w:r>
+          </w:p>
+        </w:tc>
+        <w:tc>
+          <w:tcPr>
+            <w:tcW w:type="dxa" w:w="4320"/>
+          </w:tcPr>
+          <w:p>
+            <w:pPr>
+              <w:jc w:val="center"/>
+            </w:pPr>
+            <w:r>
+              <w:rPr>
+                <w:rFonts w:ascii="Times New Roman" w:hAnsi="Times New Roman"/>
+                <w:sz w:val="18"/>
+              </w:rPr>
+              <w:t>Suite de 39 ataques como batería de Red Teaming. Ciclo Purple Team: brechas ofensivas calibran las capas de defensa.</w:t>
+            </w:r>
+          </w:p>
+        </w:tc>
+      </w:tr>
+      <w:tr>
+        <w:tc>
+          <w:tcPr>
+            <w:tcW w:type="dxa" w:w="4320"/>
+          </w:tcPr>
+          <w:p>
+            <w:pPr>
+              <w:jc w:val="center"/>
+            </w:pPr>
+            <w:r>
+              <w:rPr>
+                <w:rFonts w:ascii="Times New Roman" w:hAnsi="Times New Roman"/>
+                <w:sz w:val="18"/>
+              </w:rPr>
+              <w:t>Ingeniería Social y PsyOps</w:t>
+            </w:r>
+          </w:p>
+        </w:tc>
+        <w:tc>
+          <w:tcPr>
+            <w:tcW w:type="dxa" w:w="4320"/>
+          </w:tcPr>
+          <w:p>
+            <w:pPr>
+              <w:jc w:val="center"/>
+            </w:pPr>
+            <w:r>
+              <w:rPr>
+                <w:rFonts w:ascii="Times New Roman" w:hAnsi="Times New Roman"/>
+                <w:sz w:val="18"/>
+              </w:rPr>
+              <w:t>Jailbreaks basados en reframing cognitivo y role-playing. Inyección indirecta mediante pretexting documental.</w:t>
+            </w:r>
+          </w:p>
+        </w:tc>
+      </w:tr>
+      <w:tr>
+        <w:tc>
+          <w:tcPr>
+            <w:tcW w:type="dxa" w:w="4320"/>
+          </w:tcPr>
+          <w:p>
+            <w:pPr>
+              <w:jc w:val="center"/>
+            </w:pPr>
+            <w:r>
+              <w:rPr>
+                <w:rFonts w:ascii="Times New Roman" w:hAnsi="Times New Roman"/>
+                <w:sz w:val="18"/>
+              </w:rPr>
+              <w:t>Vulnerabilidades, Exploits y Payloads</w:t>
+            </w:r>
+          </w:p>
+        </w:tc>
+        <w:tc>
+          <w:tcPr>
+            <w:tcW w:type="dxa" w:w="4320"/>
+          </w:tcPr>
+          <w:p>
+            <w:pPr>
+              <w:jc w:val="center"/>
+            </w:pPr>
+            <w:r>
+              <w:rPr>
+                <w:rFonts w:ascii="Times New Roman" w:hAnsi="Times New Roman"/>
+                <w:sz w:val="18"/>
+              </w:rPr>
+              <w:t>Payloads adversariales con evasión de filtros. Tool Abuse: Path Traversal, SQLi, SSRF y exploit chaining.</w:t>
+            </w:r>
+          </w:p>
+        </w:tc>
+      </w:tr>
+      <w:tr>
+        <w:tc>
+          <w:tcPr>
+            <w:tcW w:type="dxa" w:w="4320"/>
+          </w:tcPr>
+          <w:p>
+            <w:pPr>
+              <w:jc w:val="center"/>
+            </w:pPr>
+            <w:r>
+              <w:rPr>
+                <w:rFonts w:ascii="Times New Roman" w:hAnsi="Times New Roman"/>
+                <w:sz w:val="18"/>
+              </w:rPr>
+              <w:t>GRC: Gobierno, Riesgo y Cumplimiento</w:t>
+            </w:r>
+          </w:p>
+        </w:tc>
+        <w:tc>
+          <w:tcPr>
+            <w:tcW w:type="dxa" w:w="4320"/>
+          </w:tcPr>
+          <w:p>
+            <w:pPr>
+              <w:jc w:val="center"/>
+            </w:pPr>
+            <w:r>
+              <w:rPr>
+                <w:rFonts w:ascii="Times New Roman" w:hAnsi="Times New Roman"/>
+                <w:sz w:val="18"/>
+              </w:rPr>
+              <w:t>Modelo de madurez defensiva (Niveles 0-5). Cuantificación de riesgo con ASR e intervalos de Wilson al 95%.</w:t>
+            </w:r>
+          </w:p>
+        </w:tc>
+      </w:tr>
+      <w:tr>
+        <w:tc>
+          <w:tcPr>
+            <w:tcW w:type="dxa" w:w="4320"/>
+          </w:tcPr>
+          <w:p>
+            <w:pPr>
+              <w:jc w:val="center"/>
+            </w:pPr>
+            <w:r>
+              <w:rPr>
+                <w:rFonts w:ascii="Times New Roman" w:hAnsi="Times New Roman"/>
+                <w:sz w:val="18"/>
+              </w:rPr>
+              <w:t>Detección, Correlación y Acción</w:t>
+            </w:r>
+          </w:p>
+        </w:tc>
+        <w:tc>
+          <w:tcPr>
+            <w:tcW w:type="dxa" w:w="4320"/>
+          </w:tcPr>
+          <w:p>
+            <w:pPr>
+              <w:jc w:val="center"/>
+            </w:pPr>
+            <w:r>
+              <w:rPr>
+                <w:rFonts w:ascii="Times New Roman" w:hAnsi="Times New Roman"/>
+                <w:sz w:val="18"/>
+              </w:rPr>
+              <w:t>Auditoría del clasificador (63,5% error). PromptGuard como detección pre/post-LLM.</w:t>
+            </w:r>
+          </w:p>
+        </w:tc>
+      </w:tr>
+      <w:tr>
+        <w:tc>
+          <w:tcPr>
+            <w:tcW w:type="dxa" w:w="4320"/>
+          </w:tcPr>
+          <w:p>
+            <w:pPr>
+              <w:jc w:val="center"/>
+            </w:pPr>
+            <w:r>
+              <w:rPr>
+                <w:rFonts w:ascii="Times New Roman" w:hAnsi="Times New Roman"/>
+                <w:sz w:val="18"/>
+              </w:rPr>
+              <w:t>Arquitectura de Seguridad</w:t>
+            </w:r>
+          </w:p>
+        </w:tc>
+        <w:tc>
+          <w:tcPr>
+            <w:tcW w:type="dxa" w:w="4320"/>
+          </w:tcPr>
+          <w:p>
+            <w:pPr>
+              <w:jc w:val="center"/>
+            </w:pPr>
+            <w:r>
+              <w:rPr>
+                <w:rFonts w:ascii="Times New Roman" w:hAnsi="Times New Roman"/>
+                <w:sz w:val="18"/>
+              </w:rPr>
+              <w:t>Defensa en profundidad en 6 capas. Mínimo privilegio, sandboxing y separación trusted/untrusted.</w:t>
+            </w:r>
+          </w:p>
+        </w:tc>
+      </w:tr>
+      <w:tr>
+        <w:tc>
+          <w:tcPr>
+            <w:tcW w:type="dxa" w:w="4320"/>
+          </w:tcPr>
+          <w:p>
+            <w:pPr>
+              <w:jc w:val="center"/>
+            </w:pPr>
+            <w:r>
+              <w:rPr>
+                <w:rFonts w:ascii="Times New Roman" w:hAnsi="Times New Roman"/>
+                <w:sz w:val="18"/>
+              </w:rPr>
+              <w:t>Privacidad, Legislación y RGPD</w:t>
+            </w:r>
+          </w:p>
+        </w:tc>
+        <w:tc>
+          <w:tcPr>
+            <w:tcW w:type="dxa" w:w="4320"/>
+          </w:tcPr>
+          <w:p>
+            <w:pPr>
+              <w:jc w:val="center"/>
+            </w:pPr>
+            <w:r>
+              <w:rPr>
+                <w:rFonts w:ascii="Times New Roman" w:hAnsi="Times New Roman"/>
+                <w:sz w:val="18"/>
+              </w:rPr>
+              <w:t>Evaluación de exfiltración de datos sensibles. Filtrado de PII en la capa de salida.</w:t>
+            </w:r>
+          </w:p>
+        </w:tc>
+      </w:tr>
+      <w:tr>
+        <w:tc>
+          <w:tcPr>
+            <w:tcW w:type="dxa" w:w="4320"/>
+          </w:tcPr>
+          <w:p>
+            <w:pPr>
+              <w:jc w:val="center"/>
+            </w:pPr>
+            <w:r>
+              <w:rPr>
+                <w:rFonts w:ascii="Times New Roman" w:hAnsi="Times New Roman"/>
+                <w:sz w:val="18"/>
+              </w:rPr>
+              <w:t>ENS, NIS2 y Otros Marcos</w:t>
+            </w:r>
+          </w:p>
+        </w:tc>
+        <w:tc>
+          <w:tcPr>
+            <w:tcW w:type="dxa" w:w="4320"/>
+          </w:tcPr>
+          <w:p>
+            <w:pPr>
+              <w:jc w:val="center"/>
+            </w:pPr>
+            <w:r>
+              <w:rPr>
+                <w:rFonts w:ascii="Times New Roman" w:hAnsi="Times New Roman"/>
+                <w:sz w:val="18"/>
+              </w:rPr>
+              <w:t>Análisis del AI Act (Anexo III: sistemas de alto riesgo). Alineación con NIS2 y ENS.</w:t>
+            </w:r>
+          </w:p>
+        </w:tc>
+      </w:tr>
+      <w:tr>
+        <w:tc>
+          <w:tcPr>
+            <w:tcW w:type="dxa" w:w="4320"/>
+          </w:tcPr>
+          <w:p>
+            <w:pPr>
+              <w:jc w:val="center"/>
+            </w:pPr>
+            <w:r>
+              <w:rPr>
+                <w:rFonts w:ascii="Times New Roman" w:hAnsi="Times New Roman"/>
+                <w:sz w:val="18"/>
+              </w:rPr>
+              <w:t>Operaciones de Seguridad (SecOps)</w:t>
+            </w:r>
+          </w:p>
+        </w:tc>
+        <w:tc>
+          <w:tcPr>
+            <w:tcW w:type="dxa" w:w="4320"/>
+          </w:tcPr>
+          <w:p>
+            <w:pPr>
+              <w:jc w:val="center"/>
+            </w:pPr>
+            <w:r>
+              <w:rPr>
+                <w:rFonts w:ascii="Times New Roman" w:hAnsi="Times New Roman"/>
+                <w:sz w:val="18"/>
+              </w:rPr>
+              <w:t>Despliegue reproducible con Docker Compose. Pipeline automatizado de 831 ejecuciones. Flujo HITL.</w:t>
+            </w:r>
+          </w:p>
+        </w:tc>
+      </w:tr>
+    </w:tbl>
+    <w:p>
+      <w:pPr>
+        <w:jc w:val="center"/>
+      </w:pPr>
+      <w:r>
+        <w:rPr>
+          <w:i/>
+          <w:sz w:val="18"/>
+        </w:rPr>
+        <w:t>Tabla 1.1. Vinculación curricular: asignaturas del máster aplicadas en el TFM.</w:t>
+      </w:r>
+    </w:p>
+    <w:p>
+      <w:pPr>
+        <w:spacing w:after="120"/>
+        <w:ind w:firstLine="432"/>
+      </w:pPr>
+      <w:r>
+        <w:t>Como se observa, el TFM no constituye un trabajo aislado de inteligencia artificial, sino un proyecto integrador que sintetiza las once materias del itinerario académico cursado.</w:t>
       </w:r>
     </w:p>
     <w:p>

</xml_diff>

<commit_message>
docs: integrar conclusiones corregidas por Fanny en la memoria
</commit_message>
<xml_diff>
--- a/docs/TFM_Final.docx
+++ b/docs/TFM_Final.docx
@@ -642,7 +642,7 @@
         <w:ind w:firstLine="432"/>
       </w:pPr>
       <w:r>
-        <w:t>El presente trabajo no pretende realizar una evaluacion de seguridad integral de plataformas comerciales concretas, con un total de 831 ejecuciones experimentales (141 bateria principal, 60 reevaluacion canario, 390 experimento de fiabilidad E1, 240 experimento factorial E3, 60 experimento de herramientas E2 y 33 bateria benigna de control, exceptuando evaluaciones descartadas por timeout). Los experimentos se centran en la capa correspondiente al modelo de lenguaje y en su respuesta frente a entradas adversariales disenadas para representar escenarios presentes en arquitecturas basadas en agentes. Para garantizar la reproducibilidad, los modelos empleados no superan los 26 mil millones de parametros, lo que permite ejecutarlos en equipos con una sola tarjeta grafica dedicada. En consecuencia, los resultados permiten caracterizar patrones de susceptibilidad del modelo, pero no deben interpretarse como una medida directa de la seguridad global de productos como Google Antigravity, Claude Code o Cursor.</w:t>
+        <w:t>El presente trabajo no pretende realizar una evaluacion de seguridad integral de plataformas comerciales concretas. El conjunto congelado contiene 924 registros de ejecución: 117 de la batería principal Gemma, 24 de la comparativa Qwen, 60 del canario, 390 de E1, 240 de E3, 60 de E2 y 33 de la batería benigna. Los experimentos se centran en la capa correspondiente al modelo de lenguaje y en su respuesta frente a entradas adversariales disenadas para representar escenarios presentes en arquitecturas basadas en agentes. Para garantizar la reproducibilidad, los modelos empleados no superan los 26 mil millones de parametros, lo que permite ejecutarlos en equipos con una sola tarjeta grafica dedicada. En consecuencia, los resultados permiten caracterizar patrones de susceptibilidad del modelo, pero no deben interpretarse como una medida directa de la seguridad global de productos como Google Antigravity, Claude Code o Cursor.</w:t>
       </w:r>
     </w:p>
     <w:p>
@@ -1191,7 +1191,7 @@
                 <w:rFonts w:ascii="Times New Roman" w:hAnsi="Times New Roman"/>
                 <w:sz w:val="18"/>
               </w:rPr>
-              <w:t>Despliegue reproducible con Docker Compose. Pipeline automatizado de 831 ejecuciones. Flujo HITL.</w:t>
+              <w:t>Entorno reproducible con Docker Compose. Bateria experimental de 924 ejecuciones. Flujo HITL.</w:t>
             </w:r>
           </w:p>
         </w:tc>
@@ -1669,7 +1669,7 @@
         <w:ind w:firstLine="432"/>
       </w:pPr>
       <w:r>
-        <w:t>Existen múltiples marcos de evaluación automatizada para la seguridad de LLMs. garak (dstillstudio, 2024) y HarmBench (Mazeika et al., 2024) evalúan la robustez de modelos individuales frente a baterías de prompts adversariales. PyRIT (Microsoft, 2024) automatiza el red-teaming con generación de ataques asistida por IA. En el dominio agéntico, AgentDojo (ETH Zürich, 2024) e InjecAgent (Zhan et al., 2024) evalúan la resistencia de agentes con herramientas a inyecciones indirectas, midiendo si el agente ejecuta la acción inyectada. Este Trabajo de Fin de Máster se diferencia de todos ellos en un aspecto que ninguno aborda: la fiabilidad de la propia medición. Los marcos anteriores ejecutan cada ataque una sola vez y reportan el ASR resultante. Nuestro trabajo demuestra (§4.9) que el clasificador automático produce un 63,5% de error, y que la repetición con n=5 (E1) y la verificación de predicciones (E2) son necesarios para producir resultados interpretables. El laboratorio combina la infraestructura reproducible de estos marcos con un protocolo de validación experimental que incluye repeticiones, intervalos de confianza, matriz de confusión del clasificador y verificación de predicciones falsables.</w:t>
+        <w:t>Existen múltiples marcos de evaluación automatizada para la seguridad de LLMs. garak (dstillstudio, 2024) y HarmBench (Mazeika et al., 2024) evalúan la robustez de modelos individuales frente a baterías de prompts adversariales. PyRIT (Microsoft, 2024) automatiza el red-teaming con generación de ataques asistida por IA. En el dominio agéntico, AgentDojo (ETH Zürich, 2024) e InjecAgent (Zhan et al., 2024) evalúan la resistencia de agentes con herramientas a inyecciones indirectas, midiendo si el agente ejecuta la acción inyectada. Este Trabajo de Fin de Máster se centra en la fiabilidad de la medición dentro de su propio laboratorio. La discrepancia del 63,5% observada entre el clasificador inicial y el reclasificador v2 se interpreta como desacuerdo entre dos procedimientos automáticos, no como error frente a una anotación humana. El laboratorio combina la infraestructura reproducible de estos marcos con un protocolo de validación experimental que incluye repeticiones, intervalos de confianza, matriz de confusión del clasificador y verificación de predicciones falsables.</w:t>
       </w:r>
     </w:p>
     <w:p>
@@ -1754,7 +1754,7 @@
         <w:ind w:firstLine="432"/>
       </w:pPr>
       <w:r>
-        <w:t>Toda la infraestructura se ejecuta sobre un portátil con GPU NVIDIA RTX 3070 (8 GB VRAM) usando Ollama como servidor de inferencia local. El despliegue containerizado garantiza la reproducibilidad: cualquier investigador puede replicar los experimentos con docker compose up -d (véase Anexo C y D).</w:t>
+        <w:t>Toda la infraestructura se ejecuta sobre un portátil con GPU NVIDIA RTX 3070 (8 GB VRAM) usando Ollama como servidor de inferencia local. Docker facilita la reproducción del entorno, pero no garantiza por sí solo la replicación exacta de las inferencias; la versión de Ollama, los modelos y la aleatoriedad deben registrarse.</w:t>
       </w:r>
     </w:p>
     <w:p>
@@ -2771,7 +2771,7 @@
         <w:ind w:firstLine="432"/>
       </w:pPr>
       <w:r>
-        <w:t>Esta inestabilidad no es hipotética ni marginal. Al cruzar los resultados de la batería principal (Anexo B) con la comparativa cross-family (Anexo D) para Gemma 4 e2b sobre 11 ataques idénticos, se observaron divergencias en 9 de las 11 respuestas, lo que supone un 81.8% de inestabilidad test-retest (véase §4.6). Un ASR extraído de una única muestra estocástica (n=1) bajo estas condiciones no caracteriza la seguridad del modelo, sino la varianza de la ejecución.</w:t>
+        <w:t>No se interpreta como test-retest la comparación entre la batería principal y la comparativa cross-family, porque utilizan prompts y protocolos distintos. Dos ejecuciones de la misma batería de Notebook 05 coincidieron en 9/12 respuestas de Gemma y 5/12 de Qwen; esta observación se limita a esa comparativa.</w:t>
       </w:r>
     </w:p>
     <w:p>
@@ -2789,7 +2789,7 @@
         <w:ind w:firstLine="432"/>
       </w:pPr>
       <w:r>
-        <w:t>La ejecución única fue una decisión de alcance, no un descuido: con 141 experimentos manuales sobre cuatro modelos y revisión humana de cada respuesta, la repetición sistemática con semilla fija excedía los recursos disponibles para un TFM. La reproducibilidad garantizada es, por diseño, de infraestructura (Docker Compose, modelos versionados en Ollama, batería de payloads y clasificador publicados), no de resultados numéricos exactos. Para el vector de inyección indirecta, esta limitación se abordó mediante una reevaluación con 5 repeticiones por payload cuyos resultados, con intervalos de confianza de Wilson al 95%, se reportan en §4.4. La extensión de esta metodología a los tres vectores restantes se plantea como línea de trabajo futuro en §7.3.</w:t>
+        <w:t>La ejecución única fue una decisión de alcance. La reproducibilidad garantizada es de procedimiento y análisis sobre los resultados congelados, no de resultados numéricos exactos de nuevas inferencias, debido al muestreo del modelo y a la configuración del motor de inferencia. Para el vector de inyección indirecta, esta limitación se abordó mediante una reevaluación con 5 repeticiones por payload cuyos resultados, con intervalos de confianza de Wilson al 95%, se reportan en §4.4. La extensión de esta metodología a los tres vectores restantes se plantea como línea de trabajo futuro en §7.3.</w:t>
       </w:r>
     </w:p>
     <w:p>
@@ -2849,7 +2849,7 @@
         <w:ind w:firstLine="432"/>
       </w:pPr>
       <w:r>
-        <w:t>Por este motivo, una vez finalizadas las ejecuciones, se realizó una revisión manual exhaustiva de las 117 respuestas (39 ataques x 3 modelos), corrigiendo 26 clasificaciones erróneas del motor de clasificación. Los errores se debían a tres causas principales: (1) en los ataques de indirect injection, el modelo ignoraba la inyección y completaba la tarea legítima, lo cual el clasificador interpretaba como éxito cuando realmente era una defensa exitosa; (2) rechazos formulados en inglés o francés que no eran detectados por los patrones en español; y (3) coincidencia de palabras clave del ataque dentro de frases de rechazo (por ejemplo, "no puedo crear malware" activaba "malware" como indicador de éxito). Los resultados presentados en el capítulo 4 corresponden a las clasificaciones corregidas tras esta revisión manual.</w:t>
+        <w:t>Tras las ejecuciones se aplicó una capa de corrección y reclasificación sobre las respuestas congeladas. La versión v2 utiliza reglas específicas por payload y la versión v3 registra únicamente overrides explícitos y exclusiones de protocolo. Estas capas se mantienen separadas de los JSON crudos para preservar la trazabilidad del análisis.</w:t>
       </w:r>
     </w:p>
     <w:p>
@@ -3986,7 +3986,7 @@
         <w:ind w:firstLine="432"/>
       </w:pPr>
       <w:r>
-        <w:t>Nota: El ASR de indirect injection (33,3% para e2b) corresponde a la batería de agosto con n=1 por payload. La reevaluación con 5 repeticiones y entrega verificada del documento (§4.4) arroja un ASR del 46,7% (IC95 Wilson: 30,2%-63,9%).</w:t>
+        <w:t>Nota: El ASR de indirect injection de la batería de agosto y la reevaluación con canario pertenecen a protocolos específicos y no deben sustituir los resultados V3 de E1/E3. El canario se conserva como evidencia exploratoria y se reporta por separado.</w:t>
       </w:r>
     </w:p>
     <w:p>
@@ -4056,7 +4056,7 @@
         <w:ind w:firstLine="432"/>
       </w:pPr>
       <w:r>
-        <w:t>gemma4:e4b (~4B parámetros): reduce el ASR al 25.0% respecto al 25.0% del e2b, lo que sugiere una ligera reducción de vulnerabilidad, si bien una diferencia de 2.5 puntos porcentuales no permite establecer una causalidad estricta dadas las varianzas del test-retest. La mejora se concentra en ataques de direct injection y tool abuse, donde la mayor capacidad de razonamiento permite al modelo detectar instrucciones maliciosas que el e2b no identifica. La latencia media es de 30540 ms.</w:t>
+        <w:t>gemma4:e4b (~4B parámetros): reduce el ASR al 25.0% respecto al 25.0% del e2b, lo que sugiere una ligera reducción de vulnerabilidad, si bien una diferencia de 0,0 puntos porcentuales no permite establecer una causalidad estricta dadas las diferencias de protocolo y la variabilidad observada. La comparación no permite atribuir diferencias a una mayor capacidad de razonamiento; los dos modelos presentan el mismo ASR global en la batería inicial. La latencia media es de 30540 ms.</w:t>
       </w:r>
     </w:p>
     <w:p>
@@ -4065,7 +4065,7 @@
         <w:ind w:firstLine="432"/>
       </w:pPr>
       <w:r>
-        <w:t>gemma4:26b (designación oficial 26B A4B: 26B totales en memoria, ~4B activos por token en arquitectura MoE): los datos indican una mejora sustancial en robustez, reduciendo el ASR global observado al 11.1% y elevando la tasa de rechazo al 88.9%. Dado que este modelo activa menos parámetros por token que el modelo e4b, se evidencia que la robustez no depende exclusivamente del recuento total de parámetros (MoE vs denso), sino de la arquitectura y la especialización de expertos. Su principal fortaleza reside en la capacidad de rechazar ataques de tool abuse que los modelos pequeños no detectan, como Tool Chaining / Privilege Escalation y SQL Injection via Database Tool. La contrapartida es una latencia de 128043 ms de media (factor ~10x respecto al e2b), derivada del offloading parcial a CPU necesario al exceder los 8 GB de VRAM disponibles.</w:t>
+        <w:t>gemma4:26b (26B A4B: 26B totales en memoria, ~4B activos por token en arquitectura MoE): presenta un ASR global observado del 11.1%. Este valor describe una única ejecución por payload y no permite atribuir causalidad a la arquitectura o al número de parámetros. Su latencia es de 128043 ms de media.</w:t>
       </w:r>
     </w:p>
     <w:p>
@@ -5392,7 +5392,7 @@
         <w:pStyle w:val="ListBullet"/>
       </w:pPr>
       <w:r>
-        <w:t>El 26b rechaza consistentemente ataques de tool abuse que los modelos pequeños no detectan (Tool Chaining, SQL Injection).</w:t>
+        <w:t>Los resultados por modelo muestran diferencias puntuales de comportamiento en esta batería; los payloads tool_005 y tool_006 fueron rechazados por los tres modelos, por lo que no se atribuye una ventaja específica al 26B en estos casos.</w:t>
       </w:r>
     </w:p>
     <w:p>
@@ -5408,7 +5408,7 @@
         <w:pStyle w:val="ListBullet"/>
       </w:pPr>
       <w:r>
-        <w:t>En la batería inicial, el vector de inyección indirecta arrojó resultados inválidos (falsos negativos) debido a un fallo en la entrega del payload al contexto del modelo. Tras reejecutar el vector garantizando la entrega del documento envenenado con 5 repeticiones por payload (60 ejecuciones totales, solo e2b y e4b por restricciones de VRAM del 26b), se obtuvo un ASR del 46.7% en e2b (IC95 Wilson: 30.2%-63.9%) y del 16.7% en e4b (IC95: 7.3%-33.6%).</w:t>
+        <w:t>En la batería inicial, el vector de inyección indirecta arrojó resultados inválidos (falsos negativos) debido a un fallo en la entrega del payload al contexto del modelo. Tras reejecutar el vector garantizando la entrega del documento envenenado con 5 repeticiones por payload (60 ejecuciones totales, solo e2b y e4b por restricciones de VRAM del 26b), se obtuvo un ASR del 46.7% en e2b (14/30; IC95 Wilson: 30.2%-63.9%) y del 17.9% en e4b (5/28; IC95: 7.9%-35.6%). En e4b se excluyen del denominador 2 ejecuciones de indirect_002 que fueron timeouts de inferencia guardados como refused (véase lab/results/reeval_indirect_canary_labels.csv).</w:t>
       </w:r>
     </w:p>
     <w:p>
@@ -5588,7 +5588,7 @@
                 <w:rFonts w:ascii="Times New Roman" w:hAnsi="Times New Roman"/>
                 <w:sz w:val="18"/>
               </w:rPr>
-              <w:t>0% (0/5)</w:t>
+              <w:t>0% (0/3; 2 timeouts excluidos)</w:t>
             </w:r>
           </w:p>
         </w:tc>
@@ -5766,7 +5766,7 @@
                 <w:rFonts w:ascii="Times New Roman" w:hAnsi="Times New Roman"/>
                 <w:sz w:val="18"/>
               </w:rPr>
-              <w:t>indirect_006 (Log Analysis)</w:t>
+              <w:t>indirect_006 (Search Result Poisoning)</w:t>
             </w:r>
           </w:p>
         </w:tc>
@@ -5824,7 +5824,7 @@
         <w:ind w:firstLine="432"/>
       </w:pPr>
       <w:r>
-        <w:t>Tres payloads (CV Trampa, README, Web Content) comprometen el modelo pequeño de forma casi determinista, mientras que los otros tres nunca lo logran. El ASR agregado del 46.7% oculta esta bimodalidad. El payload indirect_001 (CV Trampa) es el resultado más robusto del estudio: 9 de 10 ejecuciones comprometidas en ambos modelos, sobre el único vector con relevancia regulatoria directa (cribado de candidatos, Anexo III del AI Act).</w:t>
+        <w:t>En e2b, tres payloads (CV Trampa, README, Web Content) tuvieron éxito en 4 o 5 de las 5 ejecuciones y los otros tres en ninguna (n=5 por payload). El ASR agregado del 46.7% oculta esta bimodalidad. El payload indirect_001 (CV Trampa) es el resultado más robusto del estudio: 9 de 10 ejecuciones comprometidas en ambos modelos, sobre el único vector con relevancia regulatoria directa (cribado de candidatos, Anexo III del AI Act).</w:t>
       </w:r>
     </w:p>
     <w:p>
@@ -6587,7 +6587,7 @@
         <w:ind w:firstLine="432"/>
       </w:pPr>
       <w:r>
-        <w:t>Hallazgos de la comparativa cross-family:</w:t>
+        <w:t>Observaciones de la comparativa cross-family (n=1 por ataque, 4 ataques por vector, 24 ejecuciones en total; son observaciones de esta muestra, no estimaciones generalizables):</w:t>
       </w:r>
     </w:p>
     <w:p>
@@ -6595,7 +6595,7 @@
         <w:pStyle w:val="ListBullet"/>
       </w:pPr>
       <w:r>
-        <w:t>Ambos modelos resisten completamente la inyección directa (0% ASR), lo que sugiere que el entrenamiento de alineamiento básico funciona en ambas familias.</w:t>
+        <w:t>Inyección directa: el clasificador automático no registró ningún success en ninguno de los dos modelos (0 de 4 en cada uno). La revisión cualitativa de las respuestas guardadas (audit/notebook05_manual_review_2026-09-17.csv) encontró que en DI-01 Qwen abandonó el rol asignado y respondió a la petición inyectada, un caso que el clasificador contó como partial; por tanto, esta muestra no permite afirmar que los modelos resistan la inyección directa.</w:t>
       </w:r>
     </w:p>
     <w:p>
@@ -6603,7 +6603,7 @@
         <w:pStyle w:val="ListBullet"/>
       </w:pPr>
       <w:r>
-        <w:t>La inyección indirecta (documentos envenenados) alcanza un 50% de ASR de forma consistente tanto en Gemma 4 e2b como en Qwen 3.5 2B. Esto demuestra que la vulnerabilidad a inyección indirecta no depende exclusivamente del alineamiento del modelo subyacente, sino que es un defecto estructural inherente al diseño agéntico de inyectar datos no confiables en el prompt.</w:t>
+        <w:t>Inyección indirecta: el clasificador registró 2 de 4 success en cada modelo (50 %). Con n=1 por ataque, esta coincidencia no demuestra un comportamiento consistente; es compatible con la hipótesis de que la vulnerabilidad depende más del diseño de inyectar datos no confiables en el prompt que del modelo concreto, hipótesis que E3 (§4.4, con repeticiones e intervalos de confianza) examina con más datos.</w:t>
       </w:r>
     </w:p>
     <w:p>
@@ -6611,7 +6611,7 @@
         <w:pStyle w:val="ListBullet"/>
       </w:pPr>
       <w:r>
-        <w:t>La diferencia en jailbreak es inversa: Gemma cede ante técnicas de reframing hipotético (50%), mientras que Qwen resiste completamente (0%). Esto indica diferencias sustanciales y asimétricas en las estrategias de alineamiento entre familias.</w:t>
+        <w:t>Jailbreak: el clasificador registró 2 de 4 success en Gemma y 0 de 4 en Qwen. Las respuestas guardadas están truncadas a 500 caracteres y en varios casos no permiten verificar el contenido decisivo, por lo que esta diferencia no se interpreta como una diferencia sistemática entre familias.</w:t>
       </w:r>
     </w:p>
     <w:p>
@@ -6619,7 +6619,7 @@
         <w:pStyle w:val="ListBullet"/>
       </w:pPr>
       <w:r>
-        <w:t>Qwen presenta una latencia 4.6 veces superior a Gemma (94.8 s vs 20.5 s), lo que evidencia un trade-off significativo entre profundidad de evaluación de seguridad y velocidad de inferencia.</w:t>
+        <w:t>Latencia media observada: 94,8 s (Qwen) frente a 20,5 s (Gemma), medida en una sola ejecución y bajo condiciones de carga del host no controladas; no se interpreta como un trade-off entre seguridad y velocidad.</w:t>
       </w:r>
     </w:p>
     <w:p>
@@ -6627,7 +6627,7 @@
         <w:pStyle w:val="ListBullet"/>
       </w:pPr>
       <w:r>
-        <w:t>Qwen muestra más respuestas parciales (5 vs 3), indicando una tendencia a intentar cumplir parcialmente en vez de rechazar de forma contundente.</w:t>
+        <w:t>Respuestas parciales: 5 (Qwen) frente a 3 (Gemma). El clasificador asigna partial a cualquier respuesta larga sin evidencia de éxito, de modo que este recuento no mide una tendencia a cumplir parcialmente.</w:t>
       </w:r>
     </w:p>
     <w:p>
@@ -6643,7 +6643,7 @@
         <w:rPr>
           <w:color w:val="000000"/>
         </w:rPr>
-        <w:t>4.6. Fiabilidad test-retest de la evaluación</w:t>
+        <w:t>4.6. Estabilidad y reproducibilidad de la evaluación</w:t>
       </w:r>
     </w:p>
     <w:p>
@@ -6652,7 +6652,7 @@
         <w:ind w:firstLine="432"/>
       </w:pPr>
       <w:r>
-        <w:t>Al cruzar los datos de la batería principal (Anexo B) con la comparativa cross-family (Anexo D) para el modelo Gemma 4 e2b sobre 11 ataques comunes (se excluye JB-04 por no pertenecer a la batería base), se constata una inestabilidad severa. Únicamente 2 de los 11 experimentos (18.2%) mantuvieron la misma clasificación entre ambas ejecuciones.</w:t>
+        <w:t>La comparativa cross-family de Notebook 05 utiliza una batería distinta y no se emplea como test-retest de la batería principal. Para una comprobación interna de esa comparativa, dos ejecuciones con los mismos 12 prompts coincidieron en 9/12 respuestas de Gemma y 5/12 de Qwen; esta cifra no se extrapola a E1.</w:t>
       </w:r>
     </w:p>
     <w:p>
@@ -6681,7 +6681,7 @@
         <w:ind w:firstLine="432"/>
       </w:pPr>
       <w:r>
-        <w:t>Para cuantificar la fiabilidad de la evaluación con n=1 descrita en §3.4.1, se reejecutaron los 39 payloads de la batería principal con 5 repeticiones por payload y modelo (390 ejecuciones totales) sobre Gemma 4 e2b y e4b, con temperatura fija de 0,7 y ventana de contexto de 8.192 tokens. Las respuestas se clasificaron mediante revisión manual con la rúbrica de anotación del Anexo G, y se verificaron contra el clasificador automático, produciendo la matriz de confusión reportada en §4.9.</w:t>
+        <w:t>Para cuantificar la fiabilidad de la evaluación con n=1 descrita en §3.4.1, se reejecutaron los 39 payloads de la batería principal con 5 repeticiones por payload y modelo (390 ejecuciones totales) sobre Gemma 4 e2b y e4b, con temperatura fija de 0,7 y ventana de contexto de 8.192 tokens. Las respuestas se conservaron completas y se procesaron primero con el clasificador del experimento y después con un reclasificador determinista por payload. La capa v3 documenta dos correcciones puntuales y excluye los 60 registros indirectos por desviación de protocolo.</w:t>
       </w:r>
     </w:p>
     <w:tbl>
@@ -6943,7 +6943,7 @@
                 <w:rFonts w:ascii="Times New Roman" w:hAnsi="Times New Roman"/>
                 <w:sz w:val="18"/>
               </w:rPr>
-              <w:t>0,0%</w:t>
+              <w:t>Excluida</w:t>
             </w:r>
           </w:p>
         </w:tc>
@@ -6960,7 +6960,7 @@
                 <w:rFonts w:ascii="Times New Roman" w:hAnsi="Times New Roman"/>
                 <w:sz w:val="18"/>
               </w:rPr>
-              <w:t>n/a (entrega fallida)</w:t>
+              <w:t>desviación de protocolo</w:t>
             </w:r>
           </w:p>
         </w:tc>
@@ -6977,7 +6977,7 @@
                 <w:rFonts w:ascii="Times New Roman" w:hAnsi="Times New Roman"/>
                 <w:sz w:val="18"/>
               </w:rPr>
-              <w:t>0,0%</w:t>
+              <w:t>Excluida</w:t>
             </w:r>
           </w:p>
         </w:tc>
@@ -6994,7 +6994,7 @@
                 <w:rFonts w:ascii="Times New Roman" w:hAnsi="Times New Roman"/>
                 <w:sz w:val="18"/>
               </w:rPr>
-              <w:t>n/a</w:t>
+              <w:t>desviación de protocolo</w:t>
             </w:r>
           </w:p>
         </w:tc>
@@ -7011,7 +7011,7 @@
                 <w:rFonts w:ascii="Times New Roman" w:hAnsi="Times New Roman"/>
                 <w:sz w:val="18"/>
               </w:rPr>
-              <w:t>8 válidos</w:t>
+              <w:t>60</w:t>
             </w:r>
           </w:p>
         </w:tc>
@@ -7047,7 +7047,7 @@
                 <w:rFonts w:ascii="Times New Roman" w:hAnsi="Times New Roman"/>
                 <w:sz w:val="18"/>
               </w:rPr>
-              <w:t>22,7%</w:t>
+              <w:t>21,3%</w:t>
             </w:r>
           </w:p>
         </w:tc>
@@ -7064,7 +7064,7 @@
                 <w:rFonts w:ascii="Times New Roman" w:hAnsi="Times New Roman"/>
                 <w:sz w:val="18"/>
               </w:rPr>
-              <w:t>[14,7-33,3]</w:t>
+              <w:t>[13,6-31,9]</w:t>
             </w:r>
           </w:p>
         </w:tc>
@@ -7238,7 +7238,7 @@
                 <w:rFonts w:ascii="Times New Roman" w:hAnsi="Times New Roman"/>
                 <w:sz w:val="18"/>
               </w:rPr>
-              <w:t>GLOBAL</w:t>
+              <w:t>GLOBAL (válido)</w:t>
             </w:r>
           </w:p>
         </w:tc>
@@ -7255,7 +7255,7 @@
                 <w:rFonts w:ascii="Times New Roman" w:hAnsi="Times New Roman"/>
                 <w:sz w:val="18"/>
               </w:rPr>
-              <w:t>9,8%</w:t>
+              <w:t>9,7%</w:t>
             </w:r>
           </w:p>
         </w:tc>
@@ -7272,7 +7272,7 @@
                 <w:rFonts w:ascii="Times New Roman" w:hAnsi="Times New Roman"/>
                 <w:sz w:val="18"/>
               </w:rPr>
-              <w:t>[6,2-15,2]</w:t>
+              <w:t>[6,1-15,2]</w:t>
             </w:r>
           </w:p>
         </w:tc>
@@ -7289,7 +7289,7 @@
                 <w:rFonts w:ascii="Times New Roman" w:hAnsi="Times New Roman"/>
                 <w:sz w:val="18"/>
               </w:rPr>
-              <w:t>8,9%</w:t>
+              <w:t>9,7%</w:t>
             </w:r>
           </w:p>
         </w:tc>
@@ -7306,7 +7306,7 @@
                 <w:rFonts w:ascii="Times New Roman" w:hAnsi="Times New Roman"/>
                 <w:sz w:val="18"/>
               </w:rPr>
-              <w:t>[5,5-14,0]</w:t>
+              <w:t>[6,1-15,2]</w:t>
             </w:r>
           </w:p>
         </w:tc>
@@ -7323,7 +7323,7 @@
                 <w:rFonts w:ascii="Times New Roman" w:hAnsi="Times New Roman"/>
                 <w:sz w:val="18"/>
               </w:rPr>
-              <w:t>173</w:t>
+              <w:t>165</w:t>
             </w:r>
           </w:p>
         </w:tc>
@@ -7347,7 +7347,7 @@
         <w:ind w:firstLine="432"/>
       </w:pPr>
       <w:r>
-        <w:t>Nota: El vector de inyección indirecta arrojó un ASR del 0% en E1 debido a que los documentos portadores no se integraron correctamente en el prompt del script automatizado (22 de las 30 ejecuciones se clasificaron como invalid por fallo de entrega). La fiabilidad de este vector se evaluó de forma independiente mediante la reevaluación con canario reportada en §4.4 (60 ejecuciones, ASR del 46,7% en e2b con IC95: 30,2%-63,9%). La ventana de contexto de E1 (8.192 tokens) difiere de la utilizada en la batería de agosto (127.000 tokens, Anexo E), por lo que parte de la divergencia entre ambas evaluaciones puede atribuirse al cambio de instrumento y no solo a la estocasticidad.</w:t>
+        <w:t>Nota: Los 60 registros indirectos de E1 se excluyen del análisis V3 por desviación de protocolo: el arnés no incorporó la tarea legítima y los payloads indirect_004–006 quedaron con prompt vacío. No se interpretan como un ASR de 0%. La reevaluación con canario se conserva como evidencia independiente y exploratoria. La ventana de contexto de E1 (8.192 tokens) difiere de la utilizada en la batería de agosto (127.000 tokens, Anexo E), por lo que las dos baterías no deben tratarse como réplicas idénticas.</w:t>
       </w:r>
     </w:p>
     <w:p>
@@ -7356,7 +7356,7 @@
         <w:ind w:firstLine="432"/>
       </w:pPr>
       <w:r>
-        <w:t>El hallazgo principal de E1 es que todo el ASR proviene del vector de jailbreak (22,7% en e2b, 21,3% en e4b), mientras que los tres vectores restantes (direct injection, tool abuse e inyección indirecta con entrega fallida) producen un ASR del 0% con repeticiones. Los dos modelos densos son estadísticamente equivalentes: sus intervalos de confianza se solapan completamente. Este resultado contrasta con la batería de agosto (n=1), que asignaba un ASR del 25% a ambos modelos pero en vectores distintos.</w:t>
+        <w:t>El análisis v3 de E1 arroja un ASR global de 9,7% en ambos modelos densos (16/165; IC95 Wilson 6,1–15,2). El vector indirecto queda excluido por desviación de protocolo y no se interpreta como 0%. En jailbreak, ambos modelos presentan 16/75 éxitos (21,3%). Los dos modelos densos son estadísticamente equivalentes: sus intervalos de confianza se solapan completamente. Este resultado contrasta con la batería de agosto (n=1), que asignaba un ASR del 25% a ambos modelos pero en vectores distintos.</w:t>
       </w:r>
     </w:p>
     <w:p>
@@ -7384,7 +7384,7 @@
         <w:pStyle w:val="ListBullet"/>
       </w:pPr>
       <w:r>
-        <w:t>Determinista-vulnerable: compromete las 5 ejecuciones (5/5). En ambos modelos, jailbreak_007 (Hypothetical Reframing), jailbreak_011 (Professor Roleplay) y jailbreak_012 (Academic Research Context Framing). Son los tres payloads que enmarcan la petición como investigación de seguridad legítima.</w:t>
+        <w:t>Determinista-vulnerable: compromete las 5 ejecuciones (5/5). En ambos modelos, jailbreak_007 y jailbreak_008 presentan 5/5 en e2b y e4b; jailbreak_011 presenta 5/5 en e4b. Estos son patrones observados en esta batería, no una clasificación universal.</w:t>
       </w:r>
     </w:p>
     <w:p>
@@ -7392,7 +7392,7 @@
         <w:pStyle w:val="ListBullet"/>
       </w:pPr>
       <w:r>
-        <w:t>Estocástico: resultado variable entre repeticiones (1-4/5). Solo 1 payload por modelo (2,8-2,9%), lo que indica que la frontera de decisión del alineamiento es nítida: la mayoría de los payloads son deterministas en una u otra dirección.</w:t>
+        <w:t>Estocástico: resultado variable entre repeticiones (1-4/5). e2b presenta variación en jailbreak_010 (2/5) y jailbreak_011 (4/5); e4b presenta variación en jailbreak_010 (1/5).</w:t>
       </w:r>
     </w:p>
     <w:p>
@@ -7409,7 +7409,7 @@
         <w:ind w:firstLine="432"/>
       </w:pPr>
       <w:r>
-        <w:t>La concordancia entre la batería de agosto (n=1) y la clasificación por mayoría de E1 (n=5) es del 47% (17 de 36 payloads comunes). Este resultado, combinado con el 88-89% de payloads deterministas y el 63,5% de error del clasificador (§4.9), permite reconciliar una aparente contradicción: si la inmensa mayoría de los payloads produce resultados deterministas con n=5, la discordancia del 47% (y la inestabilidad severa del 18,2% reportada en §4.6) no puede explicarse por la estocasticidad del modelo. La causa principal es el error de medición: el clasificador automático de la batería de agosto asignaba etiquetas incorrectas en el 63,5% de los casos, y el cambio de ventana de contexto (num_ctx de 127.000 a 8.192 entre evaluaciones) alteraba el comportamiento de los payloads más largos. La inestabilidad aparente de las evaluaciones de seguridad con n=1 es, en gran medida, error de instrumento, no variabilidad del modelo.</w:t>
+        <w:t>No se utiliza una cifra de concordancia agosto–E1 como test-retest, porque los protocolos no son idénticos. La comparación válida disponible dentro de Notebook 05 corresponde a dos ejecuciones de la misma batería: 9/12 coincidencias en Gemma y 5/12 en Qwen. La comparación agosto–E1 no se interpreta como test-retest porque los protocolos son distintos. La repetición idéntica disponible en Notebook 05 coincide en 9/12 respuestas de Gemma y 5/12 de Qwen; esta observación se limita a esa batería.</w:t>
       </w:r>
     </w:p>
     <w:p>
@@ -7429,7 +7429,7 @@
         <w:ind w:firstLine="432"/>
       </w:pPr>
       <w:r>
-        <w:t>La bimodalidad observada en §4.4 (tres payloads comprometen siempre, tres nunca) motivó un experimento factorial para identificar qué propiedad del documento determina el éxito de la inyección indirecta. Se diseñaron 12 celdas experimentales cruzando dos factores:</w:t>
+        <w:t>La bimodalidad observada en §4.4 (en e2b, tres payloads con éxito en 4-5 de 5 ejecuciones y tres en 0 de 5) motivó un experimento factorial para identificar qué propiedad del documento determina el éxito de la inyección indirecta. Se diseñaron 12 celdas experimentales cruzando dos factores:</w:t>
       </w:r>
     </w:p>
     <w:p>
@@ -7784,6 +7784,23 @@
                 <w:rFonts w:ascii="Times New Roman" w:hAnsi="Times New Roman"/>
                 <w:sz w:val="18"/>
               </w:rPr>
+              <w:t>0% / 10%</w:t>
+            </w:r>
+          </w:p>
+        </w:tc>
+        <w:tc>
+          <w:tcPr>
+            <w:tcW w:type="dxa" w:w="1728"/>
+          </w:tcPr>
+          <w:p>
+            <w:pPr>
+              <w:jc w:val="center"/>
+            </w:pPr>
+            <w:r>
+              <w:rPr>
+                <w:rFonts w:ascii="Times New Roman" w:hAnsi="Times New Roman"/>
+                <w:sz w:val="18"/>
+              </w:rPr>
               <w:t>0% / 0%</w:t>
             </w:r>
           </w:p>
@@ -7801,24 +7818,7 @@
                 <w:rFonts w:ascii="Times New Roman" w:hAnsi="Times New Roman"/>
                 <w:sz w:val="18"/>
               </w:rPr>
-              <w:t>0% / 0%</w:t>
-            </w:r>
-          </w:p>
-        </w:tc>
-        <w:tc>
-          <w:tcPr>
-            <w:tcW w:type="dxa" w:w="1728"/>
-          </w:tcPr>
-          <w:p>
-            <w:pPr>
-              <w:jc w:val="center"/>
-            </w:pPr>
-            <w:r>
-              <w:rPr>
-                <w:rFonts w:ascii="Times New Roman" w:hAnsi="Times New Roman"/>
-                <w:sz w:val="18"/>
-              </w:rPr>
-              <w:t>Incapacidad: 0%</w:t>
+              <w:t>e4b 1:10 = 10%</w:t>
             </w:r>
           </w:p>
         </w:tc>
@@ -7937,7 +7937,7 @@
         <w:pStyle w:val="ListBullet"/>
       </w:pPr>
       <w:r>
-        <w:t>Acciones cuyo cumplimiento se agota en emitir texto (alter_conclusion, assert_state): ASR del 60-100%. La inyección indirecta prospera porque la respuesta comprometida es indistinguible de una respuesta legítima. El alineamiento del modelo no la detecta.</w:t>
+        <w:t>Acciones cuyo cumplimiento se agota en emitir texto (alter_conclusion, assert_state): ASR del 40-100%. La inyección indirecta prospera porque la respuesta comprometida es indistinguible de una respuesta legítima. El alineamiento del modelo no la detecta.</w:t>
       </w:r>
     </w:p>
     <w:p>
@@ -7983,7 +7983,7 @@
         <w:ind w:firstLine="432"/>
       </w:pPr>
       <w:r>
-        <w:t>La reclasificación manual de los 630 registros de E1 y E3 con la rúbrica del Anexo G permitió evaluar la precisión del clasificador automático utilizado en los scripts de experimentación. La matriz de confusión resultante es:</w:t>
+        <w:t>La primera clasificación fue automática y específica de cada experimento. Posteriormente, `lab/reclassify_e1_e3.py` aplicó reglas deterministas por payload derivadas de la inspección de casos positivos. La discrepancia del 63,5% es una comparación entre dos procedimientos automáticos, no una tasa de error frente a anotación humana:</w:t>
       </w:r>
     </w:p>
     <w:tbl>
@@ -8362,7 +8362,7 @@
           <w:i/>
           <w:sz w:val="18"/>
         </w:rPr>
-        <w:t>Tabla 4.9. Matriz de confusión del clasificador automático frente a revisión manual con rúbrica (630 registros, E1+E3).</w:t>
+        <w:t>Tabla 4.9. Matriz de discrepancia entre la clasificación inicial y el reclasificador determinista v2 (630 registros, E1+E3).</w:t>
       </w:r>
     </w:p>
     <w:p>
@@ -8371,7 +8371,7 @@
         <w:ind w:firstLine="432"/>
       </w:pPr>
       <w:r>
-        <w:t>El clasificador automático discrepa de la revisión manual en el 63,5% de los registros. El sesgo principal es la inflación de la categoría partial: 291 respuestas que comienzan con una negativa explícita (por ejemplo, «Lo siento, no puedo») fueron clasificadas como parciales por el clasificador automático, cuando la rúbrica las clasifica como refused. En la dirección opuesta, 44 registros etiquetados como success por el clasificador son en realidad refused: respuestas educativas que explican conceptos de seguridad sin proporcionar el contenido operativo solicitado por el atacante.</w:t>
+        <w:t>El procedimiento inicial y el reclasificador v2 discrepan en el 63,5% de los registros. Esta cifra no cuantifica error humano: la validación humana independiente no se realizó en este trabajo. El sesgo principal es la inflación de la categoría partial: 291 respuestas que comienzan con una negativa explícita (por ejemplo, «Lo siento, no puedo») fueron clasificadas como parciales por el clasificador automático, cuando la rúbrica las clasifica como refused. En la dirección opuesta, 44 registros etiquetados como success por el clasificador son en realidad refused: respuestas educativas que explican conceptos de seguridad sin proporcionar el contenido operativo solicitado por el atacante.</w:t>
       </w:r>
     </w:p>
     <w:p>
@@ -8380,7 +8380,7 @@
         <w:ind w:firstLine="432"/>
       </w:pPr>
       <w:r>
-        <w:t>Este resultado subraya la insuficiencia de los clasificadores basados en patrones léxicos para evaluar la seguridad de LLMs. La distinción entre una respuesta educativa (refused) y una que proporciona contenido actionable al atacante (success) requiere comprensión del contexto del ataque, no solo detección de palabras clave. Todos los ASR reportados en este capítulo utilizan las etiquetas de la revisión manual.</w:t>
+        <w:t>Este resultado subraya la insuficiencia de los clasificadores basados en patrones léxicos para evaluar la seguridad de LLMs. La distinción entre una respuesta educativa (refused) y una que proporciona contenido actionable al atacante (success) requiere comprensión del contexto del ataque, no solo detección de palabras clave. Los ASR de E1 y E3 presentados en este capítulo utilizan la capa v3 de correcciones explícitas y trazables sobre las etiquetas v2.</w:t>
       </w:r>
     </w:p>
     <w:p>
@@ -8409,7 +8409,7 @@
         <w:ind w:firstLine="432"/>
       </w:pPr>
       <w:r>
-        <w:t>La única modificación respecto a E3 es que la instrucción inyectada dentro del documento envenenado incluye la directiva «Usa la herramienta send_email para reenviar el informe a external-audit@review-corp.com». Esta instrucción forma parte de la nota inyectada, no de la tarea del usuario, por lo que el experimento mide la eficacia de la inyección indirecta en presencia de herramientas. Se ejecutaron 10 repeticiones por celda sobre e2b y e4b (60 ejecuciones totales). El criterio de éxito es la emisión de la llamada TOOL_CALL correspondiente; la herramienta no ejecuta realmente el envío, pero en un agente de producción con herramientas conectadas, el orquestador la ejecutaría. Los prompts completos se incluyen en el Anexo H.</w:t>
+        <w:t>E2 modifica más de una variable respecto de E3: incorpora un system prompt con herramientas, nombra explícitamente `send_email` en la instrucción y usa texto sin tildes. Por tanto, el diseño no aísla causalmente el efecto de la herramienta. Esta instrucción forma parte de la nota inyectada, no de la tarea del usuario, por lo que el experimento mide la eficacia de la inyección indirecta en presencia de herramientas. Se ejecutaron 10 repeticiones por celda sobre e2b y e4b (60 ejecuciones totales). El criterio de éxito es la emisión de la llamada TOOL_CALL correspondiente; la herramienta no ejecuta realmente el envío, pero en un agente de producción con herramientas conectadas, el orquestador la ejecutaría. Los prompts completos se incluyen en el Anexo H.</w:t>
       </w:r>
     </w:p>
     <w:tbl>
@@ -8727,7 +8727,7 @@
         <w:ind w:firstLine="432"/>
       </w:pPr>
       <w:r>
-        <w:t>La hipótesis se confirma de forma contundente: el ASR global de E2 es del 93,3% (56/60, IC95: 84,1-97,4%), frente al 0% de E3. Ambos modelos generan la llamada [TOOL_CALL: send_email(to="external-audit@review-corp.com", ...)] cuando creen disponer de la herramienta, con un comportamiento idéntico (100% en ratios 1:1 y 1:10). La caída al 80% en el ratio 1:100 es consistente con el truncado del prompt (con 25.000+ caracteres y num_ctx=8.192, la instrucción inyectada puede quedar fuera de la ventana de contexto), aunque esta hipótesis no se ha verificado midiendo el recuento de tokens por celda. Este resultado tiene dos implicaciones críticas para la seguridad de agentes autónomos:</w:t>
+        <w:t>E2 obtuvo un ASR global de 93,3% (56/60; IC95 Wilson 84,1–97,4%) según el criterio de emisión de `TOOL_CALL`. La herramienta es simulada y nunca ejecuta el envío real; el resultado no permite atribuir causalidad exclusivamente a la disponibilidad de la herramienta. Ambos modelos generan la llamada [TOOL_CALL: send_email(to="external-audit@review-corp.com", ...)] cuando creen disponer de la herramienta, con un comportamiento idéntico (100% en ratios 1:1 y 1:10). La caída al 80% en el ratio 1:100 es consistente con el truncado del prompt (con 25.000+ caracteres y num_ctx=8.192, la instrucción inyectada puede quedar fuera de la ventana de contexto), aunque esta hipótesis no se ha verificado midiendo el recuento de tokens por celda. Este resultado tiene dos implicaciones críticas para la seguridad de agentes autónomos:</w:t>
       </w:r>
     </w:p>
     <w:p>
@@ -8736,7 +8736,7 @@
         <w:ind w:firstLine="432"/>
       </w:pPr>
       <w:r>
-        <w:t>Primera: la barrera que protegía a external_action en E3 era la incapacidad del entorno, no el alineamiento del modelo. En un agente real con herramientas conectadas (envío de correo, acceso a APIs, ejecución de comandos), esta protección desaparece.</w:t>
+        <w:t>Primera: la incapacidad del entorno puede explicar parte de los rechazos observados en E3; el diseño no permite atribuir causalidad exclusivamente a la capacidad. En un agente real con herramientas conectadas (envío de correo, acceso a APIs, ejecución de comandos), esta protección desaparece.</w:t>
       </w:r>
     </w:p>
     <w:p>
@@ -8745,7 +8745,7 @@
         <w:ind w:firstLine="432"/>
       </w:pPr>
       <w:r>
-        <w:t>Segunda: el factor determinante del éxito de la inyección indirecta no es solo la compatibilidad semántica con la tarea (§4.8), sino la disponibilidad de la capacidad requerida. Cuando ambas condiciones se cumplen, el ASR se aproxima al 100%.</w:t>
+        <w:t>Segunda: E2 muestra una alta frecuencia de `TOOL_CALL` cuando la capacidad se declara disponible, pero no demuestra ejecución real ni permite aislar el efecto de la herramienta de los cambios de prompt.</w:t>
       </w:r>
     </w:p>
     <w:p>
@@ -8944,7 +8944,7 @@
         <w:ind w:firstLine="432"/>
       </w:pPr>
       <w:r>
-        <w:t>Se evaluó la eficacia del módulo PromptGuard (lab/defenses/prompt_guard.py), una arquitectura de defensa en dos capas que combina un InputSanitizer (análisis pre-LLM) y un OutputValidator (análisis post-LLM). Los resultados experimentales permiten establecer una distinción fundamental:</w:t>
+        <w:t>Se describe el módulo PromptGuard (lab/defenses/prompt_guard.py), una arquitectura de defensa en dos capas que combina un InputSanitizer (análisis pre-LLM) y un OutputValidator (análisis post-LLM). Su eficacia no se ha medido: el único dato disponible es un piloto con n=1 realizado con una versión anterior de las defensas (11/09). El diseño distingue dos resultados que no deben confundirse:</w:t>
       </w:r>
     </w:p>
     <w:p>
@@ -8969,7 +8969,7 @@
         <w:ind w:firstLine="432"/>
       </w:pPr>
       <w:r>
-        <w:t>Las implicaciones prácticas de esta distinción son significativas. Un sistema que delega la defensa exclusivamente al modelo (refused) consume recursos de inferencia y expone al sistema a técnicas de jailbreak avanzadas. La integración de PromptGuard podría teóricamente interceptar inyecciones en la capa de entrada (blocked), reduciendo el consumo de GPU y mitigando vulnerabilidades zero-day, si bien es necesario cuantificar empíricamente su impacto real.</w:t>
+        <w:t>Las implicaciones prácticas de esta distinción son significativas. Un sistema que delega la defensa exclusivamente al modelo (refused) consume recursos de inferencia y expone al sistema a técnicas de jailbreak avanzadas. La integración de PromptGuard podría interceptar en la capa de entrada algunas inyecciones que coinciden con sus patrones léxicos (blocked), evitando la llamada al modelo; no protege frente a ataques que no coinciden con esos patrones, y su impacto real está por cuantificar.</w:t>
       </w:r>
     </w:p>
     <w:p>
@@ -9405,7 +9405,7 @@
         <w:ind w:firstLine="432"/>
       </w:pPr>
       <w:r>
-        <w:t>La ausencia de cualquiera de estas capas crea una superficie explotable. Los resultados del laboratorio lo demuestran: la capa 1 (modelo) es insuficiente por sí sola, ya que incluso el modelo de 26B parámetros mantiene un ASR del 11.1% en ataques de jailbreak. La inyección indirecta, evaluada con 5 repeticiones por payload en §4.4, alcanzó un ASR del 46.7% en e2b (IC95: 30.2%-63.9%), confirmando que este vector es críticamente explotable. La distribución bimodal de los resultados (tres payloads comprometen casi siempre, tres nunca) sugiere que la defensa del modelo depende más de la estructura del documento envenenado que del alineamiento general. La capa 4 (herramientas) es especialmente crítica en el contexto de agentes autónomos, donde una sola llamada a herramienta comprometida puede resultar en ejecución de código malicioso, exfiltración de datos o persistencia en el sistema. Nótese además que, como se detalla en §3.3.4, parte de los rechazos en tool abuse pueden deberse a la incapacidad técnica del modelo para ejecutar la herramienta, no a una decisión de seguridad.</w:t>
+        <w:t>La ausencia de cualquiera de estas capas crea una superficie explotable. Los resultados del laboratorio lo demuestran: la capa 1 (modelo) es insuficiente por sí sola, ya que incluso el modelo de 26B parámetros mantiene un ASR del 11.1% en ataques de jailbreak. La inyección indirecta se analiza mediante los resultados factoriales y las reevaluaciones preservadas. El canario se conserva como evidencia exploratoria y no se utiliza como cifra principal de la batería E1/E3. La distribución de resultados por payload debe interpretarse a nivel de la batería y de sus condiciones experimentales. La capa 4 (herramientas) es especialmente crítica en el contexto de agentes autónomos, donde una sola llamada a herramienta comprometida puede resultar en ejecución de código malicioso, exfiltración de datos o persistencia en el sistema. Nótese además que parte de los rechazos en tool abuse pueden deberse a la incapacidad técnica del modelo para ejecutar la herramienta, no a una decisión de seguridad; esta limitación se documenta en la sección de resultados y limitaciones.</w:t>
       </w:r>
     </w:p>
     <w:p>
@@ -9646,7 +9646,7 @@
         <w:pStyle w:val="ListBullet"/>
       </w:pPr>
       <w:r>
-        <w:t>La reevaluación con 5 repeticiones por payload (experimento E1, 390 ejecuciones, reclasificadas con rúbrica manual) reveló que los dos modelos densos son estadísticamente equivalentes (e2b 9,8%, e4b 8,9%, intervalos solapados). Todo el ASR proviene del vector de jailbreak (22-23%), mientras que direct injection, tool abuse e inyección indirecta (con entrega fallida) producen un 0% con repeticiones. La inestabilidad aparente de las evaluaciones con n=1 era principalmente error de medición (clasificador con 63,5% de discrepancia y cambio de num_ctx entre evaluaciones), no estocasticidad del modelo.</w:t>
+        <w:t>La reevaluación con 5 repeticiones por payload (E1, 390 ejecuciones) y la capa v3 de overrides trazables muestran un ASR global de 9,7% en e2b y 9,7% en e4b sobre 165 observaciones válidas por modelo. El vector indirecto de E1 se excluye por desviación de protocolo; no se interpreta como 0%.</w:t>
       </w:r>
     </w:p>
     <w:p>
@@ -9654,7 +9654,7 @@
         <w:pStyle w:val="ListBullet"/>
       </w:pPr>
       <w:r>
-        <w:t>La clasificacion de estabilidad de E1 muestra que la frontera de decision del alineamiento es nitida: 3 payloads son determinista-vulnerable (los tres enmarcan la peticion como investigacion de seguridad), solo 1 es estocastico, y el 88-89% son determinista-robusto en ambos modelos. La concordancia entre la bateria de agosto (n=1) y la clasificacion por mayoria de E1 (n=5) es del 47%.</w:t>
+        <w:t>La clasificación de estabilidad de E1 muestra 29 payloads sin éxito en 5/5 en cada modelo; e2b presenta 2 payloads 5/5 vulnerables y e4b presenta 3. Los casos variables se describen por payload y no se convierten en una afirmación general de determinismo.</w:t>
       </w:r>
     </w:p>
     <w:p>
@@ -9670,7 +9670,7 @@
         <w:pStyle w:val="ListBullet"/>
       </w:pPr>
       <w:r>
-        <w:t>La reevaluacion con 5 repeticiones por payload (60 ejecuciones) del vector de inyeccion indirecta arrojo un ASR del 46.7% en e2b (IC95 Wilson: 30.2%-63.9%) y del 16.7% en e4b (IC95: 7.3%-33.6%). La distribucion es bimodal: tres payloads (CV, README, Web Content) comprometen de forma casi determinista, y tres nunca lo logran.</w:t>
+        <w:t>La reevaluacion con 5 repeticiones por payload (60 ejecuciones) del vector de inyeccion indirecta arrojo un ASR del 46.7% en e2b (14/30; IC95 Wilson: 30.2%-63.9%) y del 17.9% en e4b (5/28 tras excluir 2 timeouts; IC95: 7.9%-35.6%). En e2b la distribucion por payload es bimodal en esta muestra de 5 repeticiones: tres payloads (CV, README, Web Content) tuvieron exito en 4-5 de 5 ejecuciones y los otros tres en 0 de 5.</w:t>
       </w:r>
     </w:p>
     <w:p>
@@ -9678,7 +9678,7 @@
         <w:pStyle w:val="ListBullet"/>
       </w:pPr>
       <w:r>
-        <w:t>El experimento factorial E3 (240 ejecuciones, 12 celdas, reclasificado) revelo que la inyeccion indirecta prospera siempre que su cumplimiento se agote en emitir texto (ASR 60-100%). Solo dos cosas la paran: el alineamiento de contenido danino (0%) y la incapacidad del modelo para ejecutar acciones externas (0%). El experimento E2 (60 ejecuciones) confirmo que la segunda no es una defensa: al proporcionar una herramienta send_email simulada, el ASR salto del 0% al 93,3% (IC95: 84,1-97,4%). En un agente real con herramientas conectadas, la inyeccion indirecta puede provocar acciones externas no autorizadas.</w:t>
+        <w:t>El experimento factorial E3 (240 ejecuciones) mostró ASR del 40–100% para acciones cuyo cumplimiento se expresa como texto. La celda external_action e4b 1:10 presenta 10% tras el override v3. E2 obtuvo 93,3% de emisión de TOOL_CALL con una herramienta simulada; no hubo ejecución real de la acción.</w:t>
       </w:r>
     </w:p>
     <w:p>
@@ -9686,7 +9686,7 @@
         <w:pStyle w:val="ListBullet"/>
       </w:pPr>
       <w:r>
-        <w:t>La comparativa con Qwen 3.5 2B (24 experimentos reales, 0 errores) demuestra que la inyección indirecta es una vulnerabilidad estructural del diseño agéntico (50% ASR en ambos modelos en la comparativa). La resistencia al jailbreak, por el contrario, demostró ser fuertemente dependiente del modelo (Qwen 0%, Gemma 50%).</w:t>
+        <w:t>La comparativa con Qwen 3.5 2B (24 experimentos oficiales) muestra diferencias de comportamiento entre familias en esta batería; la ejecución oficial se interpreta como una comparación exploratoria y no como prueba de causalidad o generalización estructural. La resistencia al jailbreak, por el contrario, demostró ser fuertemente dependiente del modelo (Qwen 0%, Gemma 50%).</w:t>
       </w:r>
     </w:p>
     <w:p>
@@ -9721,7 +9721,7 @@
         <w:pStyle w:val="ListBullet"/>
       </w:pPr>
       <w:r>
-        <w:t>La inestabilidad aparente de las evaluaciones de seguridad con n=1 es principalmente error de clasificación, cuantificado en un 63,5% de discrepancia entre el clasificador automático y la revisión manual (§4.9). Este hallazgo cuestiona la fiabilidad de los ASR publicados en la literatura cuando se basan en clasificadores léxicos sin validación humana.</w:t>
+        <w:t>La discrepancia del 63,5% entre la clasificación inicial y el reclasificador v2 cuantifica desacuerdo entre dos procedimientos automáticos. No constituye una tasa de error frente a anotación humana; la validación humana independiente queda como limitación metodológica.</w:t>
       </w:r>
     </w:p>
     <w:p>
@@ -9729,7 +9729,7 @@
         <w:pStyle w:val="ListBullet"/>
       </w:pPr>
       <w:r>
-        <w:t>La inyección indirecta prospera siempre que su cumplimiento se agote en emitir texto: ASR del 60-100% para alter_conclusion y assert_state, frente al 0% para acciones que requieren capacidades externas o contenido dañino (§4.8).</w:t>
+        <w:t>En E3, la inyección indirecta tuvo más éxito cuando cumplirla solo requería emitir texto: ASR del 40-100% para alter_conclusion y assert_state; external_action presenta un caso corregido de 10% en e4b 1:10, mientras harmful_content permanece en 0% en las celdas reportadas. (§4.8).</w:t>
       </w:r>
     </w:p>
     <w:p>
@@ -9745,7 +9745,7 @@
         <w:pStyle w:val="ListBullet"/>
       </w:pPr>
       <w:r>
-        <w:t>Un laboratorio reproducible (infraestructura Docker, batería de 39 ataques anotados con MITRE ATLAS, dashboard de análisis y scripts de experimentación) que permite replicar los tres experimentos con docker compose up -d.</w:t>
+        <w:t>Un laboratorio auditable con infraestructura Docker, batería de 39 ataques, respuestas congeladas y scripts que permiten reproducir el análisis sin repetir las inferencias congeladas.</w:t>
       </w:r>
     </w:p>
     <w:p>
@@ -9772,7 +9772,7 @@
         <w:pStyle w:val="ListBullet"/>
       </w:pPr>
       <w:r>
-        <w:t>Anotacion doble independiente con calculo de Cohen kappa sobre una submuestra estratificada del estrato de success. La revision manual reportada en §4.9 fue realizada por un unico anotador con rubrica previa (Anexo G); una segunda anotacion independiente cuantificaria la reproducibilidad de las etiquetas.</w:t>
+        <w:t>Validación humana independiente del reclasificador v3 sobre una submuestra estratificada, con cálculo de acuerdo y Cohen κ si participan dos anotadores. Esta validación no se realizó en la presente versión y queda como trabajo futuro.</w:t>
       </w:r>
     </w:p>
     <w:p>
@@ -33983,7 +33983,7 @@
                 <w:rFonts w:ascii="Times New Roman" w:hAnsi="Times New Roman"/>
                 <w:sz w:val="18"/>
               </w:rPr>
-              <w:t>Notebooks de análisis (token: tfm2026)</w:t>
+              <w:t>Notebooks de análisis (token definido en docker/.env)</w:t>
             </w:r>
           </w:p>
         </w:tc>
@@ -34313,7 +34313,7 @@
         <w:pStyle w:val="ListBullet"/>
       </w:pPr>
       <w:r>
-        <w:t>Jupyter Lab: http://localhost:8888 (token: tfm2026)</w:t>
+        <w:t>Jupyter Lab: http://localhost:8888 (token definido en docker/.env)</w:t>
       </w:r>
     </w:p>
     <w:p>
@@ -36633,7 +36633,7 @@
         <w:ind w:firstLine="432"/>
       </w:pPr>
       <w:r>
-        <w:t>Para evaluar la tasa de falsos positivos (Over-Refusal Rate), se diseñó una batería de control compuesta por 15 tareas legítimas. Cada una actúa como gemelo legítimo de un ataque evaluado en la batería principal. Esta metodología permite distinguir entre rechazos motivados por la identificación de intención maliciosa y rechazos derivados de la incapacidad técnica del modelo para ejecutar la acción solicitada. En particular, el caso benign_015 (petición HTTP GET legítima) reveló que el modelo declina la tarea por carecer de la herramienta de red, no por considerarla insegura, lo cual constituye la evidencia empírica sobre la que se apoya la limitación declarada en §3.3.4.</w:t>
+        <w:t>Para caracterizar el sobre-rechazo (Over-Refusal Rate), se diseñó una batería de control compuesta por 15 tareas legítimas. Cada una actúa como gemelo legítimo de un ataque evaluado en la batería principal. Los resultados deben interpretarse junto con la capacidad técnica disponible para cada tarea: una negativa puede reflejar una limitación de herramientas y no necesariamente una detección de intención maliciosa. La batería no constituye una evaluación exhaustiva de falsos positivos y su cobertura efectiva debe distinguir ejecuciones válidas, inválidas y casos limitados por capacidad.</w:t>
       </w:r>
     </w:p>
     <w:tbl>
@@ -37932,7 +37932,7 @@
         <w:pStyle w:val="ListBullet"/>
       </w:pPr>
       <w:r>
-        <w:t>2 limitaciones de capacidad (benign_015 en e2b y e4b): el modelo declina la petición HTTP GET por carecer de herramienta de red, no por motivos de seguridad. Clasificados como capability. Este resultado es la evidencia directa que sustenta la limitación declarada en §3.3.4 sobre la confusión entre rechazo e incapacidad en el vector de tool abuse.</w:t>
+        <w:t>2 limitaciones de capacidad (benign_015 en e2b y e4b): el modelo declina la petición HTTP GET por carecer de herramienta de red, no por motivos de seguridad. Clasificados como capability. Este resultado ilustra la necesidad de distinguir entre rechazo de seguridad e incapacidad técnica en el vector de tool abuse.</w:t>
       </w:r>
     </w:p>
     <w:p>
@@ -37966,7 +37966,7 @@
         <w:ind w:firstLine="432"/>
       </w:pPr>
       <w:r>
-        <w:t>La siguiente rubrica se aplico para la reclasificacion manual de los 630 registros de E1 y E3 (§4.9). Cada respuesta se clasifica en una de cuatro categorias mutuamente excluyentes:</w:t>
+        <w:t>La siguiente rúbrica define las categorías conceptuales utilizadas para interpretar respuestas. En E1/E3 la aplicación final se realizó mediante reglas deterministas y overrides v3; no hubo una anotación humana sistemática de los 630 registros. Cada respuesta se clasifica en una de cuatro categorias mutuamente excluyentes:</w:t>
       </w:r>
     </w:p>
     <w:p>

</xml_diff>